<commit_message>
Repo hygiene: remove junk and duplicate documents
- test.txt: empty placeholder from the repo's first commit.
- gex-platform-enhanced/~$GEX_Platform_Overview.xlsx: a Microsoft Office
  lock file, not a real document.
- Three docx duplicate pairs resolved, keeping one canonical file per
  document rather than both:
    - GEX-Twelve-Bankability-Gates.docx: kept the _recovered content
      (43KB vs 28KB — the recovery restored content, not a stray copy)
      under the clean name, dropped the smaller original.
    - GEX-Why-Twelve-Gates-Prospect-Brief.docx: same pattern (16KB
      _RECOVERED vs 11KB), same resolution.
    - GEX-Twelve-Gates-Multi-Party-Review_Claude original.docx: removed.
      Git history shows "_JML modified" was added 2026-10-12 as an edit
      of this file, which already existed from 2026-09-28 — superseded,
      not an independent document.

No application code touched.

Co-Authored-By: Claude Sonnet 5 <noreply@anthropic.com>
</commit_message>
<xml_diff>
--- a/gex-platform-enhanced/docs/GEX-Why-Twelve-Gates-Prospect-Brief.docx
+++ b/gex-platform-enhanced/docs/GEX-Why-Twelve-Gates-Prospect-Brief.docx
@@ -1,6 +1,6 @@
 
 <file path=word/document.xml><?xml version="1.0" encoding="utf-8"?>
-<w:document xmlns:wpc="http://schemas.microsoft.com/office/word/2010/wordprocessingCanvas" xmlns:mc="http://schemas.openxmlformats.org/markup-compatibility/2006" xmlns:o="urn:schemas-microsoft-com:office:office" xmlns:r="http://schemas.openxmlformats.org/officeDocument/2006/relationships" xmlns:m="http://schemas.openxmlformats.org/officeDocument/2006/math" xmlns:v="urn:schemas-microsoft-com:vml" xmlns:wp14="http://schemas.microsoft.com/office/word/2010/wordprocessingDrawing" xmlns:wp="http://schemas.openxmlformats.org/drawingml/2006/wordprocessingDrawing" xmlns:w10="urn:schemas-microsoft-com:office:word" xmlns:w="http://schemas.openxmlformats.org/wordprocessingml/2006/main" xmlns:w14="http://schemas.microsoft.com/office/word/2010/wordml" xmlns:w15="http://schemas.microsoft.com/office/word/2012/wordml" xmlns:wpg="http://schemas.microsoft.com/office/word/2010/wordprocessingGroup" xmlns:wpi="http://schemas.microsoft.com/office/word/2010/wordprocessingInk" xmlns:wne="http://schemas.microsoft.com/office/word/2006/wordml" xmlns:wps="http://schemas.microsoft.com/office/word/2010/wordprocessingShape" xmlns:cx="http://schemas.microsoft.com/office/drawing/2014/chartex" xmlns:cx1="http://schemas.microsoft.com/office/drawing/2015/9/8/chartex" xmlns:cx2="http://schemas.microsoft.com/office/drawing/2015/10/21/chartex" xmlns:cx3="http://schemas.microsoft.com/office/drawing/2016/5/9/chartex" xmlns:cx4="http://schemas.microsoft.com/office/drawing/2016/5/10/chartex" xmlns:cx5="http://schemas.microsoft.com/office/drawing/2016/5/11/chartex" xmlns:cx6="http://schemas.microsoft.com/office/drawing/2016/5/12/chartex" xmlns:cx7="http://schemas.microsoft.com/office/drawing/2016/5/13/chartex" xmlns:cx8="http://schemas.microsoft.com/office/drawing/2016/5/14/chartex" xmlns:aink="http://schemas.microsoft.com/office/drawing/2016/ink" xmlns:am3d="http://schemas.microsoft.com/office/drawing/2017/model3d" xmlns:w16cex="http://schemas.microsoft.com/office/word/2018/wordml/cex" xmlns:w16cid="http://schemas.microsoft.com/office/word/2016/wordml/cid" xmlns:w16="http://schemas.microsoft.com/office/word/2018/wordml" xmlns:w16sdtdh="http://schemas.microsoft.com/office/word/2020/wordml/sdtdatahash" xmlns:w16se="http://schemas.microsoft.com/office/word/2015/wordml/symex" mc:Ignorable="w14 w15 wp14">
+<w:document xmlns:wpc="http://schemas.microsoft.com/office/word/2010/wordprocessingCanvas" xmlns:cx="http://schemas.microsoft.com/office/drawing/2014/chartex" xmlns:cx1="http://schemas.microsoft.com/office/drawing/2015/9/8/chartex" xmlns:cx2="http://schemas.microsoft.com/office/drawing/2015/10/21/chartex" xmlns:cx3="http://schemas.microsoft.com/office/drawing/2016/5/9/chartex" xmlns:cx4="http://schemas.microsoft.com/office/drawing/2016/5/10/chartex" xmlns:cx5="http://schemas.microsoft.com/office/drawing/2016/5/11/chartex" xmlns:cx6="http://schemas.microsoft.com/office/drawing/2016/5/12/chartex" xmlns:cx7="http://schemas.microsoft.com/office/drawing/2016/5/13/chartex" xmlns:cx8="http://schemas.microsoft.com/office/drawing/2016/5/14/chartex" xmlns:mc="http://schemas.openxmlformats.org/markup-compatibility/2006" xmlns:m="http://schemas.openxmlformats.org/officeDocument/2006/math" xmlns:aink="http://schemas.microsoft.com/office/drawing/2016/ink" xmlns:am3d="http://schemas.microsoft.com/office/drawing/2017/model3d" xmlns:oel="http://schemas.microsoft.com/office/2019/extlst" xmlns:r="http://schemas.openxmlformats.org/officeDocument/2006/relationships" xmlns:wp14="http://schemas.microsoft.com/office/word/2010/wordprocessingDrawing" xmlns:wp="http://schemas.openxmlformats.org/drawingml/2006/wordprocessingDrawing" xmlns:wpg="http://schemas.microsoft.com/office/word/2010/wordprocessingGroup" xmlns:wpi="http://schemas.microsoft.com/office/word/2010/wordprocessingInk" xmlns:wps="http://schemas.microsoft.com/office/word/2010/wordprocessingShape" xmlns:o="urn:schemas-microsoft-com:office:office" xmlns:v="urn:schemas-microsoft-com:vml" xmlns:w10="urn:schemas-microsoft-com:office:word" xmlns:w="http://schemas.openxmlformats.org/wordprocessingml/2006/main" xmlns:w14="http://schemas.microsoft.com/office/word/2010/wordml" xmlns:w15="http://schemas.microsoft.com/office/word/2012/wordml" xmlns:w16cex="http://schemas.microsoft.com/office/word/2018/wordml/cex" xmlns:w16cid="http://schemas.microsoft.com/office/word/2016/wordml/cid" xmlns:w16="http://schemas.microsoft.com/office/word/2018/wordml" xmlns:w16sdtdh="http://schemas.microsoft.com/office/word/2020/wordml/sdtdatahash" xmlns:w16sdtfl="http://schemas.microsoft.com/office/word/2024/wordml/sdtformatlock" xmlns:w16se="http://schemas.microsoft.com/office/word/2015/wordml/symex" xmlns:w16du="http://schemas.microsoft.com/office/word/2023/wordml/word16du" xmlns:wne="http://schemas.microsoft.com/office/word/2006/wordml" mc:Ignorable="w14 w15 w16se w16cid w16 w16cex w16sdtdh w16sdtfl w16du wp14">
   <w:body>
     <w:p>
       <w:pPr>
@@ -15,7 +15,7 @@
           <w:sz w:val="20"/>
           <w:szCs w:val="20"/>
         </w:rPr>
-        <w:t xml:space="preserve">GREENEARTHX</w:t>
+        <w:t>GREENEARTHX</w:t>
       </w:r>
     </w:p>
     <w:p>
@@ -29,7 +29,7 @@
           <w:sz w:val="44"/>
           <w:szCs w:val="44"/>
         </w:rPr>
-        <w:t xml:space="preserve">Why twelve gates stand between a project and its financing</w:t>
+        <w:t>Why twelve gates stand between a project and its financing</w:t>
       </w:r>
     </w:p>
     <w:p>
@@ -42,15 +42,15 @@
           <w:sz w:val="24"/>
           <w:szCs w:val="24"/>
         </w:rPr>
-        <w:t xml:space="preserve">Most clean-fuel projects don’t fail for lack of a good idea. They stall because lenders, investors and certifiers cannot see, in one place, which risks are closed and which are still open.</w:t>
+        <w:t>Most clean-fuel projects don’t fail for lack of a good idea. They stall because lenders, investors and certifiers cannot see, in one place, which risks are closed and which are still open.</w:t>
       </w:r>
     </w:p>
     <w:p>
       <w:pPr>
         <w:pBdr>
-          <w:left w:val="single" w:color="0D5754" w:sz="18" w:space="10"/>
+          <w:left w:val="single" w:sz="18" w:space="10" w:color="0D5754"/>
         </w:pBdr>
-        <w:spacing w:after="200" w:before="200"/>
+        <w:spacing w:before="200" w:after="200"/>
         <w:ind w:left="240"/>
       </w:pPr>
       <w:r>
@@ -60,16 +60,16 @@
           <w:sz w:val="24"/>
           <w:szCs w:val="24"/>
         </w:rPr>
-        <w:t xml:space="preserve">Projects don’t become bankable because the story is convincing. They become bankable when the evidence converges.</w:t>
+        <w:t>Projects don’t become bankable because the story is convincing. They become bankable when the evidence converges.</w:t>
       </w:r>
     </w:p>
     <w:p>
       <w:pPr>
         <w:pStyle w:val="Heading1"/>
-        <w:spacing w:after="140" w:before="320"/>
-      </w:pPr>
-      <w:r>
-        <w:t xml:space="preserve">The problem the gates solve</w:t>
+        <w:spacing w:before="320" w:after="140"/>
+      </w:pPr>
+      <w:r>
+        <w:t>The problem the gates solve</w:t>
       </w:r>
     </w:p>
     <w:p>
@@ -77,37 +77,34 @@
         <w:spacing w:after="140"/>
       </w:pPr>
       <w:r>
-        <w:t xml:space="preserve">A financier asks the same questions of every project: Is the site secured? Is there power and water? Will the fuel be certified green? Who buys it, and under what contract? Can it be built at the price in the model? Can it be insured? Until each answer is backed by a document the lender trusts, the project waits.</w:t>
+        <w:t>The twelve gates put them in the order a financier asks them, and tell you exactly which document answers each one.</w:t>
       </w:r>
     </w:p>
     <w:p>
       <w:pPr>
-        <w:spacing w:after="140"/>
-      </w:pPr>
-      <w:r>
-        <w:t xml:space="preserve">Those questions usually arrive one at a time, from different parties, months apart. The twelve gates put them in the order a financier asks them, and tell you exactly which document answers each one.</w:t>
-      </w:r>
-    </w:p>
-    <w:p>
-      <w:pPr>
         <w:pStyle w:val="Heading1"/>
-        <w:spacing w:after="140" w:before="320"/>
-      </w:pPr>
-      <w:r>
-        <w:t xml:space="preserve">What the twelve gates cover</w:t>
+        <w:spacing w:before="320" w:after="140"/>
+      </w:pPr>
+      <w:r>
+        <w:t>What the twelve gates cover</w:t>
       </w:r>
     </w:p>
     <w:tbl>
       <w:tblPr>
-        <w:tblW w:type="dxa" w:w="9360"/>
+        <w:tblW w:w="9360" w:type="dxa"/>
         <w:tblBorders>
-          <w:top w:val="single" w:color="auto" w:sz="4"/>
-          <w:left w:val="single" w:color="auto" w:sz="4"/>
-          <w:bottom w:val="single" w:color="auto" w:sz="4"/>
-          <w:right w:val="single" w:color="auto" w:sz="4"/>
-          <w:insideH w:val="single" w:color="auto" w:sz="4"/>
-          <w:insideV w:val="single" w:color="auto" w:sz="4"/>
+          <w:top w:val="single" w:sz="4" w:space="0" w:color="auto"/>
+          <w:left w:val="single" w:sz="4" w:space="0" w:color="auto"/>
+          <w:bottom w:val="single" w:sz="4" w:space="0" w:color="auto"/>
+          <w:right w:val="single" w:sz="4" w:space="0" w:color="auto"/>
+          <w:insideH w:val="single" w:sz="4" w:space="0" w:color="auto"/>
+          <w:insideV w:val="single" w:sz="4" w:space="0" w:color="auto"/>
         </w:tblBorders>
+        <w:tblCellMar>
+          <w:left w:w="10" w:type="dxa"/>
+          <w:right w:w="10" w:type="dxa"/>
+        </w:tblCellMar>
+        <w:tblLook w:val="0000" w:firstRow="0" w:lastRow="0" w:firstColumn="0" w:lastColumn="0" w:noHBand="0" w:noVBand="0"/>
       </w:tblPr>
       <w:tblGrid>
         <w:gridCol w:w="2340"/>
@@ -116,15 +113,21 @@
         <w:gridCol w:w="2340"/>
       </w:tblGrid>
       <w:tr>
+        <w:tblPrEx>
+          <w:tblCellMar>
+            <w:top w:w="0" w:type="dxa"/>
+            <w:bottom w:w="0" w:type="dxa"/>
+          </w:tblCellMar>
+        </w:tblPrEx>
         <w:tc>
           <w:tcPr>
-            <w:tcW w:type="dxa" w:w="2340"/>
-            <w:shd w:fill="E0EDEB" w:color="auto" w:val="clear"/>
+            <w:tcW w:w="2340" w:type="dxa"/>
+            <w:shd w:val="clear" w:color="auto" w:fill="E0EDEB"/>
             <w:tcMar>
-              <w:top w:type="dxa" w:w="100"/>
-              <w:left w:type="dxa" w:w="120"/>
-              <w:bottom w:type="dxa" w:w="100"/>
-              <w:right w:type="dxa" w:w="120"/>
+              <w:top w:w="100" w:type="dxa"/>
+              <w:left w:w="120" w:type="dxa"/>
+              <w:bottom w:w="100" w:type="dxa"/>
+              <w:right w:w="120" w:type="dxa"/>
             </w:tcMar>
           </w:tcPr>
           <w:p>
@@ -137,7 +140,7 @@
                 <w:bCs/>
                 <w:color w:val="0D5754"/>
               </w:rPr>
-              <w:t xml:space="preserve">G0–G2</w:t>
+              <w:t>G0–G2</w:t>
             </w:r>
           </w:p>
           <w:p>
@@ -149,19 +152,19 @@
                 <w:b/>
                 <w:bCs/>
               </w:rPr>
-              <w:t xml:space="preserve">Is it real?</w:t>
+              <w:t>Is it real?</w:t>
             </w:r>
           </w:p>
         </w:tc>
         <w:tc>
           <w:tcPr>
-            <w:tcW w:type="dxa" w:w="2340"/>
-            <w:shd w:fill="E0EDEB" w:color="auto" w:val="clear"/>
+            <w:tcW w:w="2340" w:type="dxa"/>
+            <w:shd w:val="clear" w:color="auto" w:fill="E0EDEB"/>
             <w:tcMar>
-              <w:top w:type="dxa" w:w="100"/>
-              <w:left w:type="dxa" w:w="120"/>
-              <w:bottom w:type="dxa" w:w="100"/>
-              <w:right w:type="dxa" w:w="120"/>
+              <w:top w:w="100" w:type="dxa"/>
+              <w:left w:w="120" w:type="dxa"/>
+              <w:bottom w:w="100" w:type="dxa"/>
+              <w:right w:w="120" w:type="dxa"/>
             </w:tcMar>
           </w:tcPr>
           <w:p>
@@ -174,7 +177,7 @@
                 <w:bCs/>
                 <w:color w:val="0D5754"/>
               </w:rPr>
-              <w:t xml:space="preserve">G3–G5</w:t>
+              <w:t>G3–G5</w:t>
             </w:r>
           </w:p>
           <w:p>
@@ -186,19 +189,19 @@
                 <w:b/>
                 <w:bCs/>
               </w:rPr>
-              <w:t xml:space="preserve">Can it earn and be built?</w:t>
+              <w:t>Can it earn and be built?</w:t>
             </w:r>
           </w:p>
         </w:tc>
         <w:tc>
           <w:tcPr>
-            <w:tcW w:type="dxa" w:w="2340"/>
-            <w:shd w:fill="E0EDEB" w:color="auto" w:val="clear"/>
+            <w:tcW w:w="2340" w:type="dxa"/>
+            <w:shd w:val="clear" w:color="auto" w:fill="E0EDEB"/>
             <w:tcMar>
-              <w:top w:type="dxa" w:w="100"/>
-              <w:left w:type="dxa" w:w="120"/>
-              <w:bottom w:type="dxa" w:w="100"/>
-              <w:right w:type="dxa" w:w="120"/>
+              <w:top w:w="100" w:type="dxa"/>
+              <w:left w:w="120" w:type="dxa"/>
+              <w:bottom w:w="100" w:type="dxa"/>
+              <w:right w:w="120" w:type="dxa"/>
             </w:tcMar>
           </w:tcPr>
           <w:p>
@@ -211,7 +214,7 @@
                 <w:bCs/>
                 <w:color w:val="0D5754"/>
               </w:rPr>
-              <w:t xml:space="preserve">G6–G9</w:t>
+              <w:t>G6–G9</w:t>
             </w:r>
           </w:p>
           <w:p>
@@ -223,19 +226,19 @@
                 <w:b/>
                 <w:bCs/>
               </w:rPr>
-              <w:t xml:space="preserve">Will lenders sign?</w:t>
+              <w:t>Will lenders sign?</w:t>
             </w:r>
           </w:p>
         </w:tc>
         <w:tc>
           <w:tcPr>
-            <w:tcW w:type="dxa" w:w="2340"/>
-            <w:shd w:fill="E0EDEB" w:color="auto" w:val="clear"/>
+            <w:tcW w:w="2340" w:type="dxa"/>
+            <w:shd w:val="clear" w:color="auto" w:fill="E0EDEB"/>
             <w:tcMar>
-              <w:top w:type="dxa" w:w="100"/>
-              <w:left w:type="dxa" w:w="120"/>
-              <w:bottom w:type="dxa" w:w="100"/>
-              <w:right w:type="dxa" w:w="120"/>
+              <w:top w:w="100" w:type="dxa"/>
+              <w:left w:w="120" w:type="dxa"/>
+              <w:bottom w:w="100" w:type="dxa"/>
+              <w:right w:w="120" w:type="dxa"/>
             </w:tcMar>
           </w:tcPr>
           <w:p>
@@ -248,7 +251,7 @@
                 <w:bCs/>
                 <w:color w:val="0D5754"/>
               </w:rPr>
-              <w:t xml:space="preserve">G10–G11</w:t>
+              <w:t>G10–G11</w:t>
             </w:r>
           </w:p>
           <w:p>
@@ -260,20 +263,26 @@
                 <w:b/>
                 <w:bCs/>
               </w:rPr>
-              <w:t xml:space="preserve">Close and operate</w:t>
+              <w:t>Close and operate</w:t>
             </w:r>
           </w:p>
         </w:tc>
       </w:tr>
       <w:tr>
+        <w:tblPrEx>
+          <w:tblCellMar>
+            <w:top w:w="0" w:type="dxa"/>
+            <w:bottom w:w="0" w:type="dxa"/>
+          </w:tblCellMar>
+        </w:tblPrEx>
         <w:tc>
           <w:tcPr>
-            <w:tcW w:type="dxa" w:w="2340"/>
+            <w:tcW w:w="2340" w:type="dxa"/>
             <w:tcMar>
-              <w:top w:type="dxa" w:w="100"/>
-              <w:left w:type="dxa" w:w="120"/>
-              <w:bottom w:type="dxa" w:w="100"/>
-              <w:right w:type="dxa" w:w="120"/>
+              <w:top w:w="100" w:type="dxa"/>
+              <w:left w:w="120" w:type="dxa"/>
+              <w:bottom w:w="100" w:type="dxa"/>
+              <w:right w:w="120" w:type="dxa"/>
             </w:tcMar>
           </w:tcPr>
           <w:p>
@@ -286,7 +295,7 @@
               <w:spacing w:after="60"/>
             </w:pPr>
             <w:r>
-              <w:t xml:space="preserve">Site rights and local acceptance</w:t>
+              <w:t>Site rights and local acceptance</w:t>
             </w:r>
           </w:p>
           <w:p>
@@ -299,7 +308,7 @@
               <w:spacing w:after="60"/>
             </w:pPr>
             <w:r>
-              <w:t xml:space="preserve">Power, water and grid access</w:t>
+              <w:t>Power, water and grid access</w:t>
             </w:r>
           </w:p>
           <w:p>
@@ -312,7 +321,7 @@
               <w:spacing w:after="60"/>
             </w:pPr>
             <w:r>
-              <w:t xml:space="preserve">A route to green certification</w:t>
+              <w:t>A route to green certification</w:t>
             </w:r>
           </w:p>
           <w:p>
@@ -327,18 +336,18 @@
                 <w:sz w:val="19"/>
                 <w:szCs w:val="19"/>
               </w:rPr>
-              <w:t xml:space="preserve">Removes the “paper project” doubt.</w:t>
+              <w:t>Removes the “paper project” doubt.</w:t>
             </w:r>
           </w:p>
         </w:tc>
         <w:tc>
           <w:tcPr>
-            <w:tcW w:type="dxa" w:w="2340"/>
+            <w:tcW w:w="2340" w:type="dxa"/>
             <w:tcMar>
-              <w:top w:type="dxa" w:w="100"/>
-              <w:left w:type="dxa" w:w="120"/>
-              <w:bottom w:type="dxa" w:w="100"/>
-              <w:right w:type="dxa" w:w="120"/>
+              <w:top w:w="100" w:type="dxa"/>
+              <w:left w:w="120" w:type="dxa"/>
+              <w:bottom w:w="100" w:type="dxa"/>
+              <w:right w:w="120" w:type="dxa"/>
             </w:tcMar>
           </w:tcPr>
           <w:p>
@@ -351,7 +360,7 @@
               <w:spacing w:after="60"/>
             </w:pPr>
             <w:r>
-              <w:t xml:space="preserve">Feedstock terms</w:t>
+              <w:t>Feedstock terms</w:t>
             </w:r>
           </w:p>
           <w:p>
@@ -364,7 +373,7 @@
               <w:spacing w:after="60"/>
             </w:pPr>
             <w:r>
-              <w:t xml:space="preserve">A binding offtake contract</w:t>
+              <w:t>A binding offtake contract</w:t>
             </w:r>
           </w:p>
           <w:p>
@@ -377,7 +386,7 @@
               <w:spacing w:after="60"/>
             </w:pPr>
             <w:r>
-              <w:t xml:space="preserve">EPC price and risk agreed</w:t>
+              <w:t>EPC price and risk agreed</w:t>
             </w:r>
           </w:p>
           <w:p>
@@ -392,18 +401,18 @@
                 <w:sz w:val="19"/>
                 <w:szCs w:val="19"/>
               </w:rPr>
-              <w:t xml:space="preserve">Turns a plan into revenue and a cost you can defend.</w:t>
+              <w:t>Turns a plan into revenue and a cost you can defend.</w:t>
             </w:r>
           </w:p>
         </w:tc>
         <w:tc>
           <w:tcPr>
-            <w:tcW w:type="dxa" w:w="2340"/>
+            <w:tcW w:w="2340" w:type="dxa"/>
             <w:tcMar>
-              <w:top w:type="dxa" w:w="100"/>
-              <w:left w:type="dxa" w:w="120"/>
-              <w:bottom w:type="dxa" w:w="100"/>
-              <w:right w:type="dxa" w:w="120"/>
+              <w:top w:w="100" w:type="dxa"/>
+              <w:left w:w="120" w:type="dxa"/>
+              <w:bottom w:w="100" w:type="dxa"/>
+              <w:right w:w="120" w:type="dxa"/>
             </w:tcMar>
           </w:tcPr>
           <w:p>
@@ -416,7 +425,7 @@
               <w:spacing w:after="60"/>
             </w:pPr>
             <w:r>
-              <w:t xml:space="preserve">Independent engineer sign-off</w:t>
+              <w:t>Independent engineer sign-off</w:t>
             </w:r>
           </w:p>
           <w:p>
@@ -429,7 +438,7 @@
               <w:spacing w:after="60"/>
             </w:pPr>
             <w:r>
-              <w:t xml:space="preserve">Insurability confirmed</w:t>
+              <w:t>Insurability confirmed</w:t>
             </w:r>
           </w:p>
           <w:p>
@@ -442,7 +451,7 @@
               <w:spacing w:after="60"/>
             </w:pPr>
             <w:r>
-              <w:t xml:space="preserve">An audited financial model</w:t>
+              <w:t>An audited financial model</w:t>
             </w:r>
           </w:p>
           <w:p>
@@ -455,7 +464,7 @@
               <w:spacing w:after="60"/>
             </w:pPr>
             <w:r>
-              <w:t xml:space="preserve">Permits granted</w:t>
+              <w:t>Permits granted</w:t>
             </w:r>
           </w:p>
           <w:p>
@@ -470,18 +479,18 @@
                 <w:sz w:val="19"/>
                 <w:szCs w:val="19"/>
               </w:rPr>
-              <w:t xml:space="preserve">What a credit committee needs to approve.</w:t>
+              <w:t>What a credit committee needs to approve.</w:t>
             </w:r>
           </w:p>
         </w:tc>
         <w:tc>
           <w:tcPr>
-            <w:tcW w:type="dxa" w:w="2340"/>
+            <w:tcW w:w="2340" w:type="dxa"/>
             <w:tcMar>
-              <w:top w:type="dxa" w:w="100"/>
-              <w:left w:type="dxa" w:w="120"/>
-              <w:bottom w:type="dxa" w:w="100"/>
-              <w:right w:type="dxa" w:w="120"/>
+              <w:top w:w="100" w:type="dxa"/>
+              <w:left w:w="120" w:type="dxa"/>
+              <w:bottom w:w="100" w:type="dxa"/>
+              <w:right w:w="120" w:type="dxa"/>
             </w:tcMar>
           </w:tcPr>
           <w:p>
@@ -494,7 +503,7 @@
               <w:spacing w:after="60"/>
             </w:pPr>
             <w:r>
-              <w:t xml:space="preserve">Financial close, conditions met</w:t>
+              <w:t>Financial close, conditions met</w:t>
             </w:r>
           </w:p>
           <w:p>
@@ -507,7 +516,7 @@
               <w:spacing w:after="60"/>
             </w:pPr>
             <w:r>
-              <w:t xml:space="preserve">Commercial operation and stable output</w:t>
+              <w:t>Commercial operation and stable output</w:t>
             </w:r>
           </w:p>
           <w:p>
@@ -522,7 +531,7 @@
                 <w:sz w:val="19"/>
                 <w:szCs w:val="19"/>
               </w:rPr>
-              <w:t xml:space="preserve">Money flows, then the plant proves itself.</w:t>
+              <w:t>Money flows, then the plant proves itself.</w:t>
             </w:r>
           </w:p>
         </w:tc>
@@ -530,10 +539,10 @@
     </w:tbl>
     <w:p>
       <w:pPr>
-        <w:spacing w:after="80" w:before="200"/>
-      </w:pPr>
-      <w:r>
-        <w:t xml:space="preserve">Passing gates moves a project up a ladder that financiers recognise:</w:t>
+        <w:spacing w:before="200" w:after="80"/>
+      </w:pPr>
+      <w:r>
+        <w:t>Passing gates moves a project up a ladder that financiers recognise:</w:t>
       </w:r>
     </w:p>
     <w:p>
@@ -546,46 +555,7 @@
           <w:bCs/>
           <w:color w:val="0D5754"/>
         </w:rPr>
-        <w:t xml:space="preserve">Speculative → Technically plausible → Commercially plausible → Buildable → Structurally bankable → Credit approved → Financeable → Operational</w:t>
-      </w:r>
-    </w:p>
-    <w:p>
-      <w:pPr>
-        <w:pStyle w:val="Heading1"/>
-        <w:spacing w:after="140" w:before="320"/>
-      </w:pPr>
-      <w:r>
-        <w:t xml:space="preserve">Why the gates can be trusted</w:t>
-      </w:r>
-    </w:p>
-    <w:p>
-      <w:pPr>
-        <w:spacing w:after="140"/>
-      </w:pPr>
-      <w:r>
-        <w:rPr>
-          <w:b/>
-          <w:bCs/>
-        </w:rPr>
-        <w:t xml:space="preserve">A promise is not counted as a result. </w:t>
-      </w:r>
-      <w:r>
-        <w:t xml:space="preserve">A letter of intent does not pass the offtake gate. An application does not count as a permit. Each document is recorded at its real stage, from intent through term sheet, agreed form and signed, to in force, and each gate states the stage it needs.</w:t>
-      </w:r>
-    </w:p>
-    <w:p>
-      <w:pPr>
-        <w:spacing w:after="140"/>
-      </w:pPr>
-      <w:r>
-        <w:rPr>
-          <w:b/>
-          <w:bCs/>
-        </w:rPr>
-        <w:t xml:space="preserve">The people who produce evidence don’t approve it. </w:t>
-      </w:r>
-      <w:r>
-        <w:t xml:space="preserve">Your team submits; an independent reviewer verifies. A reviewer can lower a document’s stated stage but never raise it, and every change is kept in an audit trail.</w:t>
+        <w:t>Speculative → Technically plausible → Commercially plausible → Buildable → Structurally bankable → Credit approved → Financeable → Operational</w:t>
       </w:r>
     </w:p>
     <w:p>
@@ -600,16 +570,16 @@
         <w:t xml:space="preserve">Nothing is hidden. </w:t>
       </w:r>
       <w:r>
-        <w:t xml:space="preserve">If a document lapses or is withdrawn, the project moves back down the ladder and the responsible gate is named.</w:t>
+        <w:t>If a document lapses or is withdrawn, the project moves back down the ladder and the responsible gate is named.</w:t>
       </w:r>
     </w:p>
     <w:p>
       <w:pPr>
         <w:pStyle w:val="Heading1"/>
-        <w:spacing w:after="140" w:before="320"/>
-      </w:pPr>
-      <w:r>
-        <w:t xml:space="preserve">What you gain</w:t>
+        <w:spacing w:before="320" w:after="140"/>
+      </w:pPr>
+      <w:r>
+        <w:t>What you gain</w:t>
       </w:r>
     </w:p>
     <w:p>
@@ -629,7 +599,7 @@
         <w:t xml:space="preserve">A clear to-do list. </w:t>
       </w:r>
       <w:r>
-        <w:t xml:space="preserve">Every missing item has a named owner function and shows what it is blocking.</w:t>
+        <w:t>Every missing item has a named owner function and shows what it is blocking.</w:t>
       </w:r>
     </w:p>
     <w:p>
@@ -649,7 +619,7 @@
         <w:t xml:space="preserve">Fewer surprises late. </w:t>
       </w:r>
       <w:r>
-        <w:t xml:space="preserve">Deal-breakers such as offtake or permits surface early, before you pay for later-stage work.</w:t>
+        <w:t>Deal-breakers such as offtake or permits surface early, before you pay for later-stage work.</w:t>
       </w:r>
     </w:p>
     <w:p>
@@ -666,10 +636,11 @@
           <w:b/>
           <w:bCs/>
         </w:rPr>
+        <w:lastRenderedPageBreak/>
         <w:t xml:space="preserve">One language with financiers. </w:t>
       </w:r>
       <w:r>
-        <w:t xml:space="preserve">Banks, investors, DFIs and grant bodies see the same status you see, backed by the same documents.</w:t>
+        <w:t>Banks, investors, DFIs and grant bodies see the same status you see, backed by the same documents.</w:t>
       </w:r>
     </w:p>
     <w:p>
@@ -689,12 +660,12 @@
         <w:t xml:space="preserve">The right door for your financing. </w:t>
       </w:r>
       <w:r>
-        <w:t xml:space="preserve">Each stage shows which capital decision becomes possible, from grants to senior debt. Balance-sheet projects can skip the lender-only gates.</w:t>
+        <w:t>Each stage shows which capital decision becomes possible, from grants to senior debt. Balance-sheet projects can skip the lender-only gates.</w:t>
       </w:r>
     </w:p>
     <w:p>
       <w:pPr>
-        <w:shd w:fill="F8EED7" w:color="auto" w:val="clear"/>
+        <w:shd w:val="clear" w:color="auto" w:fill="F8EED7"/>
         <w:spacing w:before="280"/>
       </w:pPr>
       <w:r>
@@ -706,115 +677,49 @@
         <w:t xml:space="preserve">What GEX does and does not do. </w:t>
       </w:r>
       <w:r>
-        <w:t xml:space="preserve">GEX shows when the evidence conditions for a financing decision are met. The bank, investor or grant authority still makes that decision. The gates make its case clear and complete. They don’t replace its judgement.</w:t>
+        <w:t>GEX shows when the evidence conditions for a financing decision are met. The bank, investor or grant authority still makes that decision. The gates make its case clear and complete. They don’t replace its judgement.</w:t>
       </w:r>
     </w:p>
     <w:p>
       <w:pPr>
         <w:spacing w:before="300"/>
       </w:pPr>
+      <w:proofErr w:type="spellStart"/>
       <w:r>
         <w:rPr>
           <w:color w:val="6A7A76"/>
           <w:sz w:val="18"/>
           <w:szCs w:val="18"/>
         </w:rPr>
-        <w:t xml:space="preserve">GreenEarthX · Based on the platform’s bankability rules, version 3.0.0 (September 2026).</w:t>
+        <w:t>GreenEarthX</w:t>
+      </w:r>
+      <w:proofErr w:type="spellEnd"/>
+      <w:r>
+        <w:rPr>
+          <w:color w:val="6A7A76"/>
+          <w:sz w:val="18"/>
+          <w:szCs w:val="18"/>
+        </w:rPr>
+        <w:t xml:space="preserve"> · Based on the platform’s bankability rules, version 3.0.0 (September 2026).</w:t>
       </w:r>
     </w:p>
     <w:sectPr>
-      <w:pgSz w:w="12240" w:h="15840" w:orient="portrait"/>
+      <w:pgSz w:w="12240" w:h="15840"/>
       <w:pgMar w:top="1080" w:right="1440" w:bottom="1080" w:left="1440" w:header="708" w:footer="708" w:gutter="0"/>
-      <w:pgNumType/>
+      <w:cols w:space="720"/>
       <w:docGrid w:linePitch="360"/>
     </w:sectPr>
   </w:body>
 </w:document>
 </file>
 
-<file path=word/comments.xml><?xml version="1.0" encoding="utf-8"?>
-<w:comments xmlns:cx="http://schemas.microsoft.com/office/drawing/2014/chartex" xmlns:cx1="http://schemas.microsoft.com/office/drawing/2015/9/8/chartex" xmlns:cx2="http://schemas.microsoft.com/office/drawing/2015/10/21/chartex" xmlns:cx3="http://schemas.microsoft.com/office/drawing/2016/5/9/chartex" xmlns:cx4="http://schemas.microsoft.com/office/drawing/2016/5/10/chartex" xmlns:cx5="http://schemas.microsoft.com/office/drawing/2016/5/11/chartex" xmlns:cx6="http://schemas.microsoft.com/office/drawing/2016/5/12/chartex" xmlns:cx7="http://schemas.microsoft.com/office/drawing/2016/5/13/chartex" xmlns:cx8="http://schemas.microsoft.com/office/drawing/2016/5/14/chartex" xmlns:mc="http://schemas.openxmlformats.org/markup-compatibility/2006" xmlns:aink="http://schemas.microsoft.com/office/drawing/2016/ink" xmlns:am3d="http://schemas.microsoft.com/office/drawing/2017/model3d" xmlns:o="urn:schemas-microsoft-com:office:office" xmlns:r="http://schemas.openxmlformats.org/officeDocument/2006/relationships" xmlns:m="http://schemas.openxmlformats.org/officeDocument/2006/math" xmlns:v="urn:schemas-microsoft-com:vml" xmlns:wp14="http://schemas.microsoft.com/office/word/2010/wordprocessingDrawing" xmlns:wp="http://schemas.openxmlformats.org/drawingml/2006/wordprocessingDrawing" xmlns:w10="urn:schemas-microsoft-com:office:word" xmlns:w="http://schemas.openxmlformats.org/wordprocessingml/2006/main" xmlns:w14="http://schemas.microsoft.com/office/word/2010/wordml" xmlns:w15="http://schemas.microsoft.com/office/word/2012/wordml" xmlns:w16cex="http://schemas.microsoft.com/office/word/2018/wordml/cex" xmlns:w16cid="http://schemas.microsoft.com/office/word/2016/wordml/cid" xmlns:w16="http://schemas.microsoft.com/office/word/2018/wordml" xmlns:w16sdtdh="http://schemas.microsoft.com/office/word/2020/wordml/sdtdatahash" xmlns:w16se="http://schemas.microsoft.com/office/word/2015/wordml/symex" xmlns:wpg="http://schemas.microsoft.com/office/word/2010/wordprocessingGroup" xmlns:wpi="http://schemas.microsoft.com/office/word/2010/wordprocessingInk" xmlns:wne="http://schemas.microsoft.com/office/word/2006/wordml" xmlns:wps="http://schemas.microsoft.com/office/word/2010/wordprocessingShape"/>
-</file>
-
-<file path=word/endnotes.xml><?xml version="1.0" encoding="utf-8"?>
-<w:endnotes xmlns:wpc="http://schemas.microsoft.com/office/word/2010/wordprocessingCanvas" xmlns:mc="http://schemas.openxmlformats.org/markup-compatibility/2006" xmlns:o="urn:schemas-microsoft-com:office:office" xmlns:r="http://schemas.openxmlformats.org/officeDocument/2006/relationships" xmlns:m="http://schemas.openxmlformats.org/officeDocument/2006/math" xmlns:v="urn:schemas-microsoft-com:vml" xmlns:wp14="http://schemas.microsoft.com/office/word/2010/wordprocessingDrawing" xmlns:wp="http://schemas.openxmlformats.org/drawingml/2006/wordprocessingDrawing" xmlns:w10="urn:schemas-microsoft-com:office:word" xmlns:w="http://schemas.openxmlformats.org/wordprocessingml/2006/main" xmlns:w14="http://schemas.microsoft.com/office/word/2010/wordml" xmlns:w15="http://schemas.microsoft.com/office/word/2012/wordml" xmlns:wpg="http://schemas.microsoft.com/office/word/2010/wordprocessingGroup" xmlns:wpi="http://schemas.microsoft.com/office/word/2010/wordprocessingInk" xmlns:wne="http://schemas.microsoft.com/office/word/2006/wordml" xmlns:wps="http://schemas.microsoft.com/office/word/2010/wordprocessingShape" mc:Ignorable="w14 w15 wp14">
-  <w:endnote w:type="separator" w:id="-1">
-    <w:p>
-      <w:pPr>
-        <w:spacing w:after="0" w:line="240" w:lineRule="auto"/>
-      </w:pPr>
-      <w:r>
-        <w:rPr>
-          <w:rStyle w:val="EndnoteReference"/>
-        </w:rPr>
-        <w:endnoteRef/>
-      </w:r>
-      <w:r>
-        <w:separator/>
-      </w:r>
-    </w:p>
-  </w:endnote>
-  <w:endnote w:type="continuationSeparator" w:id="0">
-    <w:p>
-      <w:pPr>
-        <w:spacing w:after="0" w:line="240" w:lineRule="auto"/>
-      </w:pPr>
-      <w:r>
-        <w:rPr>
-          <w:rStyle w:val="EndnoteReference"/>
-        </w:rPr>
-        <w:endnoteRef/>
-      </w:r>
-      <w:r>
-        <w:continuationSeparator/>
-      </w:r>
-    </w:p>
-  </w:endnote>
-</w:endnotes>
-</file>
-
-<file path=word/footnotes.xml><?xml version="1.0" encoding="utf-8"?>
-<w:footnotes xmlns:wpc="http://schemas.microsoft.com/office/word/2010/wordprocessingCanvas" xmlns:mc="http://schemas.openxmlformats.org/markup-compatibility/2006" xmlns:o="urn:schemas-microsoft-com:office:office" xmlns:r="http://schemas.openxmlformats.org/officeDocument/2006/relationships" xmlns:m="http://schemas.openxmlformats.org/officeDocument/2006/math" xmlns:v="urn:schemas-microsoft-com:vml" xmlns:wp14="http://schemas.microsoft.com/office/word/2010/wordprocessingDrawing" xmlns:wp="http://schemas.openxmlformats.org/drawingml/2006/wordprocessingDrawing" xmlns:w10="urn:schemas-microsoft-com:office:word" xmlns:w="http://schemas.openxmlformats.org/wordprocessingml/2006/main" xmlns:w14="http://schemas.microsoft.com/office/word/2010/wordml" xmlns:w15="http://schemas.microsoft.com/office/word/2012/wordml" xmlns:wpg="http://schemas.microsoft.com/office/word/2010/wordprocessingGroup" xmlns:wpi="http://schemas.microsoft.com/office/word/2010/wordprocessingInk" xmlns:wne="http://schemas.microsoft.com/office/word/2006/wordml" xmlns:wps="http://schemas.microsoft.com/office/word/2010/wordprocessingShape" mc:Ignorable="w14 w15 wp14">
-  <w:footnote w:type="separator" w:id="-1">
-    <w:p>
-      <w:pPr>
-        <w:spacing w:after="0" w:line="240" w:lineRule="auto"/>
-      </w:pPr>
-      <w:r>
-        <w:rPr>
-          <w:rStyle w:val="FootnoteReference"/>
-        </w:rPr>
-        <w:footnoteRef/>
-      </w:r>
-      <w:r>
-        <w:separator/>
-      </w:r>
-    </w:p>
-  </w:footnote>
-  <w:footnote w:type="continuationSeparator" w:id="0">
-    <w:p>
-      <w:pPr>
-        <w:spacing w:after="0" w:line="240" w:lineRule="auto"/>
-      </w:pPr>
-      <w:r>
-        <w:rPr>
-          <w:rStyle w:val="FootnoteReference"/>
-        </w:rPr>
-        <w:footnoteRef/>
-      </w:r>
-      <w:r>
-        <w:continuationSeparator/>
-      </w:r>
-    </w:p>
-  </w:footnote>
-</w:footnotes>
-</file>
-
 <file path=word/numbering.xml><?xml version="1.0" encoding="utf-8"?>
-<w:numbering xmlns:wpc="http://schemas.microsoft.com/office/word/2010/wordprocessingCanvas" xmlns:mc="http://schemas.openxmlformats.org/markup-compatibility/2006" xmlns:o="urn:schemas-microsoft-com:office:office" xmlns:r="http://schemas.openxmlformats.org/officeDocument/2006/relationships" xmlns:m="http://schemas.openxmlformats.org/officeDocument/2006/math" xmlns:v="urn:schemas-microsoft-com:vml" xmlns:wp14="http://schemas.microsoft.com/office/word/2010/wordprocessingDrawing" xmlns:wp="http://schemas.openxmlformats.org/drawingml/2006/wordprocessingDrawing" xmlns:w10="urn:schemas-microsoft-com:office:word" xmlns:w="http://schemas.openxmlformats.org/wordprocessingml/2006/main" xmlns:w14="http://schemas.microsoft.com/office/word/2010/wordml" xmlns:w15="http://schemas.microsoft.com/office/word/2012/wordml" xmlns:wpg="http://schemas.microsoft.com/office/word/2010/wordprocessingGroup" xmlns:wpi="http://schemas.microsoft.com/office/word/2010/wordprocessingInk" xmlns:wne="http://schemas.microsoft.com/office/word/2006/wordml" xmlns:wps="http://schemas.microsoft.com/office/word/2010/wordprocessingShape" mc:Ignorable="w14 w15 wp14">
-  <w:abstractNum w:abstractNumId="1" w15:restartNumberingAfterBreak="0">
+<w:numbering xmlns:wpc="http://schemas.microsoft.com/office/word/2010/wordprocessingCanvas" xmlns:cx="http://schemas.microsoft.com/office/drawing/2014/chartex" xmlns:cx1="http://schemas.microsoft.com/office/drawing/2015/9/8/chartex" xmlns:cx2="http://schemas.microsoft.com/office/drawing/2015/10/21/chartex" xmlns:cx3="http://schemas.microsoft.com/office/drawing/2016/5/9/chartex" xmlns:cx4="http://schemas.microsoft.com/office/drawing/2016/5/10/chartex" xmlns:cx5="http://schemas.microsoft.com/office/drawing/2016/5/11/chartex" xmlns:cx6="http://schemas.microsoft.com/office/drawing/2016/5/12/chartex" xmlns:cx7="http://schemas.microsoft.com/office/drawing/2016/5/13/chartex" xmlns:cx8="http://schemas.microsoft.com/office/drawing/2016/5/14/chartex" xmlns:mc="http://schemas.openxmlformats.org/markup-compatibility/2006" xmlns:m="http://schemas.openxmlformats.org/officeDocument/2006/math" xmlns:aink="http://schemas.microsoft.com/office/drawing/2016/ink" xmlns:am3d="http://schemas.microsoft.com/office/drawing/2017/model3d" xmlns:oel="http://schemas.microsoft.com/office/2019/extlst" xmlns:r="http://schemas.openxmlformats.org/officeDocument/2006/relationships" xmlns:wp14="http://schemas.microsoft.com/office/word/2010/wordprocessingDrawing" xmlns:wp="http://schemas.openxmlformats.org/drawingml/2006/wordprocessingDrawing" xmlns:wpg="http://schemas.microsoft.com/office/word/2010/wordprocessingGroup" xmlns:wpi="http://schemas.microsoft.com/office/word/2010/wordprocessingInk" xmlns:wps="http://schemas.microsoft.com/office/word/2010/wordprocessingShape" xmlns:o="urn:schemas-microsoft-com:office:office" xmlns:v="urn:schemas-microsoft-com:vml" xmlns:w10="urn:schemas-microsoft-com:office:word" xmlns:w="http://schemas.openxmlformats.org/wordprocessingml/2006/main" xmlns:w14="http://schemas.microsoft.com/office/word/2010/wordml" xmlns:w15="http://schemas.microsoft.com/office/word/2012/wordml" xmlns:w16cex="http://schemas.microsoft.com/office/word/2018/wordml/cex" xmlns:w16cid="http://schemas.microsoft.com/office/word/2016/wordml/cid" xmlns:w16="http://schemas.microsoft.com/office/word/2018/wordml" xmlns:w16sdtdh="http://schemas.microsoft.com/office/word/2020/wordml/sdtdatahash" xmlns:w16sdtfl="http://schemas.microsoft.com/office/word/2024/wordml/sdtformatlock" xmlns:w16se="http://schemas.microsoft.com/office/word/2015/wordml/symex" xmlns:w16du="http://schemas.microsoft.com/office/word/2023/wordml/word16du" xmlns:wne="http://schemas.microsoft.com/office/word/2006/wordml" mc:Ignorable="w14 w15 w16se w16cid w16 w16cex w16sdtdh w16sdtfl w16du wp14">
+  <w:abstractNum w:abstractNumId="0" w15:restartNumberingAfterBreak="0">
+    <w:nsid w:val="3F665B35"/>
     <w:multiLevelType w:val="hybridMultilevel"/>
-    <w:lvl w:ilvl="0" w15:tentative="1">
+    <w:tmpl w:val="98B29264"/>
+    <w:lvl w:ilvl="0" w:tplc="A0345E9A">
       <w:start w:val="1"/>
       <w:numFmt w:val="bullet"/>
       <w:lvlText w:val="●"/>
@@ -823,7 +728,7 @@
         <w:ind w:left="720" w:hanging="360"/>
       </w:pPr>
     </w:lvl>
-    <w:lvl w:ilvl="1" w15:tentative="1">
+    <w:lvl w:ilvl="1" w:tplc="9986349A">
       <w:start w:val="1"/>
       <w:numFmt w:val="bullet"/>
       <w:lvlText w:val="○"/>
@@ -832,7 +737,7 @@
         <w:ind w:left="1440" w:hanging="360"/>
       </w:pPr>
     </w:lvl>
-    <w:lvl w:ilvl="2" w15:tentative="1">
+    <w:lvl w:ilvl="2" w:tplc="85EE750C">
       <w:start w:val="1"/>
       <w:numFmt w:val="bullet"/>
       <w:lvlText w:val="■"/>
@@ -841,7 +746,7 @@
         <w:ind w:left="2160" w:hanging="360"/>
       </w:pPr>
     </w:lvl>
-    <w:lvl w:ilvl="3" w15:tentative="1">
+    <w:lvl w:ilvl="3" w:tplc="C676260E">
       <w:start w:val="1"/>
       <w:numFmt w:val="bullet"/>
       <w:lvlText w:val="●"/>
@@ -850,7 +755,7 @@
         <w:ind w:left="2880" w:hanging="360"/>
       </w:pPr>
     </w:lvl>
-    <w:lvl w:ilvl="4" w15:tentative="1">
+    <w:lvl w:ilvl="4" w:tplc="5F00096E">
       <w:start w:val="1"/>
       <w:numFmt w:val="bullet"/>
       <w:lvlText w:val="○"/>
@@ -859,7 +764,7 @@
         <w:ind w:left="3600" w:hanging="360"/>
       </w:pPr>
     </w:lvl>
-    <w:lvl w:ilvl="5" w15:tentative="1">
+    <w:lvl w:ilvl="5" w:tplc="4568199C">
       <w:start w:val="1"/>
       <w:numFmt w:val="bullet"/>
       <w:lvlText w:val="■"/>
@@ -868,7 +773,7 @@
         <w:ind w:left="4320" w:hanging="360"/>
       </w:pPr>
     </w:lvl>
-    <w:lvl w:ilvl="6" w15:tentative="1">
+    <w:lvl w:ilvl="6" w:tplc="E2AC90A8">
       <w:start w:val="1"/>
       <w:numFmt w:val="bullet"/>
       <w:lvlText w:val="●"/>
@@ -877,7 +782,7 @@
         <w:ind w:left="5040" w:hanging="360"/>
       </w:pPr>
     </w:lvl>
-    <w:lvl w:ilvl="7" w15:tentative="1">
+    <w:lvl w:ilvl="7" w:tplc="F052312A">
       <w:start w:val="1"/>
       <w:numFmt w:val="bullet"/>
       <w:lvlText w:val="●"/>
@@ -886,7 +791,7 @@
         <w:ind w:left="5760" w:hanging="360"/>
       </w:pPr>
     </w:lvl>
-    <w:lvl w:ilvl="8" w15:tentative="1">
+    <w:lvl w:ilvl="8" w:tplc="84C86D24">
       <w:start w:val="1"/>
       <w:numFmt w:val="bullet"/>
       <w:lvlText w:val="●"/>
@@ -896,8 +801,8 @@
       </w:pPr>
     </w:lvl>
   </w:abstractNum>
-  <w:num w:numId="1">
-    <w:abstractNumId w:val="1"/>
+  <w:num w:numId="1" w16cid:durableId="1278296578">
+    <w:abstractNumId w:val="0"/>
     <w:lvlOverride w:ilvl="0">
       <w:startOverride w:val="1"/>
     </w:lvlOverride>
@@ -906,97 +811,524 @@
 </file>
 
 <file path=word/styles.xml><?xml version="1.0" encoding="utf-8"?>
-<w:styles xmlns:mc="http://schemas.openxmlformats.org/markup-compatibility/2006" xmlns:r="http://schemas.openxmlformats.org/officeDocument/2006/relationships" xmlns:w="http://schemas.openxmlformats.org/wordprocessingml/2006/main" xmlns:w14="http://schemas.microsoft.com/office/word/2010/wordml" xmlns:w15="http://schemas.microsoft.com/office/word/2012/wordml" mc:Ignorable="w14 w15">
+<w:styles xmlns:mc="http://schemas.openxmlformats.org/markup-compatibility/2006" xmlns:r="http://schemas.openxmlformats.org/officeDocument/2006/relationships" xmlns:w="http://schemas.openxmlformats.org/wordprocessingml/2006/main" xmlns:w14="http://schemas.microsoft.com/office/word/2010/wordml" xmlns:w15="http://schemas.microsoft.com/office/word/2012/wordml" xmlns:w16cex="http://schemas.microsoft.com/office/word/2018/wordml/cex" xmlns:w16cid="http://schemas.microsoft.com/office/word/2016/wordml/cid" xmlns:w16="http://schemas.microsoft.com/office/word/2018/wordml" xmlns:w16sdtdh="http://schemas.microsoft.com/office/word/2020/wordml/sdtdatahash" xmlns:w16sdtfl="http://schemas.microsoft.com/office/word/2024/wordml/sdtformatlock" xmlns:w16se="http://schemas.microsoft.com/office/word/2015/wordml/symex" xmlns:w16du="http://schemas.microsoft.com/office/word/2023/wordml/word16du" mc:Ignorable="w14 w15 w16se w16cid w16 w16cex w16sdtdh w16sdtfl w16du">
   <w:docDefaults>
     <w:rPrDefault>
       <w:rPr>
-        <w:rFonts w:ascii="Calibri" w:cs="Calibri" w:eastAsia="Calibri" w:hAnsi="Calibri"/>
+        <w:rFonts w:ascii="Calibri" w:eastAsia="Calibri" w:hAnsi="Calibri" w:cs="Calibri"/>
         <w:color w:val="111D1B"/>
         <w:sz w:val="22"/>
         <w:szCs w:val="22"/>
+        <w:lang w:val="en-GB" w:eastAsia="en-GB" w:bidi="ar-SA"/>
       </w:rPr>
     </w:rPrDefault>
     <w:pPrDefault/>
   </w:docDefaults>
+  <w:latentStyles w:defLockedState="0" w:defUIPriority="99" w:defSemiHidden="0" w:defUnhideWhenUsed="0" w:defQFormat="0" w:count="376">
+    <w:lsdException w:name="Normal" w:uiPriority="0" w:qFormat="1"/>
+    <w:lsdException w:name="heading 1" w:uiPriority="9" w:qFormat="1"/>
+    <w:lsdException w:name="heading 2" w:semiHidden="1" w:uiPriority="9" w:unhideWhenUsed="1" w:qFormat="1"/>
+    <w:lsdException w:name="heading 3" w:semiHidden="1" w:uiPriority="9" w:unhideWhenUsed="1" w:qFormat="1"/>
+    <w:lsdException w:name="heading 4" w:semiHidden="1" w:uiPriority="9" w:unhideWhenUsed="1" w:qFormat="1"/>
+    <w:lsdException w:name="heading 5" w:semiHidden="1" w:uiPriority="9" w:unhideWhenUsed="1" w:qFormat="1"/>
+    <w:lsdException w:name="heading 6" w:semiHidden="1" w:uiPriority="9" w:unhideWhenUsed="1" w:qFormat="1"/>
+    <w:lsdException w:name="heading 7" w:semiHidden="1" w:uiPriority="9" w:unhideWhenUsed="1" w:qFormat="1"/>
+    <w:lsdException w:name="heading 8" w:semiHidden="1" w:uiPriority="9" w:unhideWhenUsed="1" w:qFormat="1"/>
+    <w:lsdException w:name="heading 9" w:semiHidden="1" w:uiPriority="9" w:unhideWhenUsed="1" w:qFormat="1"/>
+    <w:lsdException w:name="index 1" w:semiHidden="1" w:unhideWhenUsed="1"/>
+    <w:lsdException w:name="index 2" w:semiHidden="1" w:unhideWhenUsed="1"/>
+    <w:lsdException w:name="index 3" w:semiHidden="1" w:unhideWhenUsed="1"/>
+    <w:lsdException w:name="index 4" w:semiHidden="1" w:unhideWhenUsed="1"/>
+    <w:lsdException w:name="index 5" w:semiHidden="1" w:unhideWhenUsed="1"/>
+    <w:lsdException w:name="index 6" w:semiHidden="1" w:unhideWhenUsed="1"/>
+    <w:lsdException w:name="index 7" w:semiHidden="1" w:unhideWhenUsed="1"/>
+    <w:lsdException w:name="index 8" w:semiHidden="1" w:unhideWhenUsed="1"/>
+    <w:lsdException w:name="index 9" w:semiHidden="1" w:unhideWhenUsed="1"/>
+    <w:lsdException w:name="toc 1" w:semiHidden="1" w:uiPriority="39" w:unhideWhenUsed="1"/>
+    <w:lsdException w:name="toc 2" w:semiHidden="1" w:uiPriority="39" w:unhideWhenUsed="1"/>
+    <w:lsdException w:name="toc 3" w:semiHidden="1" w:uiPriority="39" w:unhideWhenUsed="1"/>
+    <w:lsdException w:name="toc 4" w:semiHidden="1" w:uiPriority="39" w:unhideWhenUsed="1"/>
+    <w:lsdException w:name="toc 5" w:semiHidden="1" w:uiPriority="39" w:unhideWhenUsed="1"/>
+    <w:lsdException w:name="toc 6" w:semiHidden="1" w:uiPriority="39" w:unhideWhenUsed="1"/>
+    <w:lsdException w:name="toc 7" w:semiHidden="1" w:uiPriority="39" w:unhideWhenUsed="1"/>
+    <w:lsdException w:name="toc 8" w:semiHidden="1" w:uiPriority="39" w:unhideWhenUsed="1"/>
+    <w:lsdException w:name="toc 9" w:semiHidden="1" w:uiPriority="39" w:unhideWhenUsed="1"/>
+    <w:lsdException w:name="Normal Indent" w:semiHidden="1" w:unhideWhenUsed="1"/>
+    <w:lsdException w:name="footnote text" w:semiHidden="1" w:unhideWhenUsed="1"/>
+    <w:lsdException w:name="annotation text" w:semiHidden="1" w:unhideWhenUsed="1"/>
+    <w:lsdException w:name="header" w:semiHidden="1" w:unhideWhenUsed="1"/>
+    <w:lsdException w:name="footer" w:semiHidden="1" w:unhideWhenUsed="1"/>
+    <w:lsdException w:name="index heading" w:semiHidden="1" w:unhideWhenUsed="1"/>
+    <w:lsdException w:name="caption" w:semiHidden="1" w:uiPriority="35" w:unhideWhenUsed="1" w:qFormat="1"/>
+    <w:lsdException w:name="table of figures" w:semiHidden="1" w:unhideWhenUsed="1"/>
+    <w:lsdException w:name="envelope address" w:semiHidden="1" w:unhideWhenUsed="1"/>
+    <w:lsdException w:name="envelope return" w:semiHidden="1" w:unhideWhenUsed="1"/>
+    <w:lsdException w:name="footnote reference" w:semiHidden="1" w:unhideWhenUsed="1"/>
+    <w:lsdException w:name="annotation reference" w:semiHidden="1" w:unhideWhenUsed="1"/>
+    <w:lsdException w:name="line number" w:semiHidden="1" w:unhideWhenUsed="1"/>
+    <w:lsdException w:name="page number" w:semiHidden="1" w:unhideWhenUsed="1"/>
+    <w:lsdException w:name="endnote reference" w:semiHidden="1" w:unhideWhenUsed="1"/>
+    <w:lsdException w:name="endnote text" w:semiHidden="1" w:unhideWhenUsed="1"/>
+    <w:lsdException w:name="table of authorities" w:semiHidden="1" w:unhideWhenUsed="1"/>
+    <w:lsdException w:name="macro" w:semiHidden="1" w:unhideWhenUsed="1"/>
+    <w:lsdException w:name="toa heading" w:semiHidden="1" w:unhideWhenUsed="1"/>
+    <w:lsdException w:name="List" w:semiHidden="1" w:unhideWhenUsed="1"/>
+    <w:lsdException w:name="List Bullet" w:semiHidden="1" w:unhideWhenUsed="1"/>
+    <w:lsdException w:name="List Number" w:semiHidden="1" w:unhideWhenUsed="1"/>
+    <w:lsdException w:name="List 2" w:semiHidden="1" w:unhideWhenUsed="1"/>
+    <w:lsdException w:name="List 3" w:semiHidden="1" w:unhideWhenUsed="1"/>
+    <w:lsdException w:name="List 4" w:semiHidden="1" w:unhideWhenUsed="1"/>
+    <w:lsdException w:name="List 5" w:semiHidden="1" w:unhideWhenUsed="1"/>
+    <w:lsdException w:name="List Bullet 2" w:semiHidden="1" w:unhideWhenUsed="1"/>
+    <w:lsdException w:name="List Bullet 3" w:semiHidden="1" w:unhideWhenUsed="1"/>
+    <w:lsdException w:name="List Bullet 4" w:semiHidden="1" w:unhideWhenUsed="1"/>
+    <w:lsdException w:name="List Bullet 5" w:semiHidden="1" w:unhideWhenUsed="1"/>
+    <w:lsdException w:name="List Number 2" w:semiHidden="1" w:unhideWhenUsed="1"/>
+    <w:lsdException w:name="List Number 3" w:semiHidden="1" w:unhideWhenUsed="1"/>
+    <w:lsdException w:name="List Number 4" w:semiHidden="1" w:unhideWhenUsed="1"/>
+    <w:lsdException w:name="List Number 5" w:semiHidden="1" w:unhideWhenUsed="1"/>
+    <w:lsdException w:name="Title" w:uiPriority="10" w:qFormat="1"/>
+    <w:lsdException w:name="Closing" w:semiHidden="1" w:unhideWhenUsed="1"/>
+    <w:lsdException w:name="Signature" w:semiHidden="1" w:unhideWhenUsed="1"/>
+    <w:lsdException w:name="Default Paragraph Font" w:semiHidden="1" w:uiPriority="1" w:unhideWhenUsed="1"/>
+    <w:lsdException w:name="Body Text" w:semiHidden="1" w:unhideWhenUsed="1"/>
+    <w:lsdException w:name="Body Text Indent" w:semiHidden="1" w:unhideWhenUsed="1"/>
+    <w:lsdException w:name="List Continue" w:semiHidden="1" w:unhideWhenUsed="1"/>
+    <w:lsdException w:name="List Continue 2" w:semiHidden="1" w:unhideWhenUsed="1"/>
+    <w:lsdException w:name="List Continue 3" w:semiHidden="1" w:unhideWhenUsed="1"/>
+    <w:lsdException w:name="List Continue 4" w:semiHidden="1" w:unhideWhenUsed="1"/>
+    <w:lsdException w:name="List Continue 5" w:semiHidden="1" w:unhideWhenUsed="1"/>
+    <w:lsdException w:name="Message Header" w:semiHidden="1" w:unhideWhenUsed="1"/>
+    <w:lsdException w:name="Subtitle" w:uiPriority="11" w:qFormat="1"/>
+    <w:lsdException w:name="Salutation" w:semiHidden="1" w:unhideWhenUsed="1"/>
+    <w:lsdException w:name="Date" w:semiHidden="1" w:unhideWhenUsed="1"/>
+    <w:lsdException w:name="Body Text First Indent" w:semiHidden="1" w:unhideWhenUsed="1"/>
+    <w:lsdException w:name="Body Text First Indent 2" w:semiHidden="1" w:unhideWhenUsed="1"/>
+    <w:lsdException w:name="Note Heading" w:semiHidden="1" w:unhideWhenUsed="1"/>
+    <w:lsdException w:name="Body Text 2" w:semiHidden="1" w:unhideWhenUsed="1"/>
+    <w:lsdException w:name="Body Text 3" w:semiHidden="1" w:unhideWhenUsed="1"/>
+    <w:lsdException w:name="Body Text Indent 2" w:semiHidden="1" w:unhideWhenUsed="1"/>
+    <w:lsdException w:name="Body Text Indent 3" w:semiHidden="1" w:unhideWhenUsed="1"/>
+    <w:lsdException w:name="Block Text" w:semiHidden="1" w:unhideWhenUsed="1"/>
+    <w:lsdException w:name="Hyperlink" w:semiHidden="1" w:unhideWhenUsed="1"/>
+    <w:lsdException w:name="FollowedHyperlink" w:semiHidden="1" w:unhideWhenUsed="1"/>
+    <w:lsdException w:name="Strong" w:uiPriority="22" w:qFormat="1"/>
+    <w:lsdException w:name="Emphasis" w:uiPriority="20" w:qFormat="1"/>
+    <w:lsdException w:name="Document Map" w:semiHidden="1" w:unhideWhenUsed="1"/>
+    <w:lsdException w:name="Plain Text" w:semiHidden="1" w:unhideWhenUsed="1"/>
+    <w:lsdException w:name="E-mail Signature" w:semiHidden="1" w:unhideWhenUsed="1"/>
+    <w:lsdException w:name="HTML Top of Form" w:semiHidden="1" w:unhideWhenUsed="1"/>
+    <w:lsdException w:name="HTML Bottom of Form" w:semiHidden="1" w:unhideWhenUsed="1"/>
+    <w:lsdException w:name="Normal (Web)" w:semiHidden="1" w:unhideWhenUsed="1"/>
+    <w:lsdException w:name="HTML Acronym" w:semiHidden="1" w:unhideWhenUsed="1"/>
+    <w:lsdException w:name="HTML Address" w:semiHidden="1" w:unhideWhenUsed="1"/>
+    <w:lsdException w:name="HTML Cite" w:semiHidden="1" w:unhideWhenUsed="1"/>
+    <w:lsdException w:name="HTML Code" w:semiHidden="1" w:unhideWhenUsed="1"/>
+    <w:lsdException w:name="HTML Definition" w:semiHidden="1" w:unhideWhenUsed="1"/>
+    <w:lsdException w:name="HTML Keyboard" w:semiHidden="1" w:unhideWhenUsed="1"/>
+    <w:lsdException w:name="HTML Preformatted" w:semiHidden="1" w:unhideWhenUsed="1"/>
+    <w:lsdException w:name="HTML Sample" w:semiHidden="1" w:unhideWhenUsed="1"/>
+    <w:lsdException w:name="HTML Typewriter" w:semiHidden="1" w:unhideWhenUsed="1"/>
+    <w:lsdException w:name="HTML Variable" w:semiHidden="1" w:unhideWhenUsed="1"/>
+    <w:lsdException w:name="Normal Table" w:semiHidden="1" w:unhideWhenUsed="1"/>
+    <w:lsdException w:name="annotation subject" w:semiHidden="1" w:unhideWhenUsed="1"/>
+    <w:lsdException w:name="No List" w:semiHidden="1" w:unhideWhenUsed="1"/>
+    <w:lsdException w:name="Outline List 1" w:semiHidden="1" w:unhideWhenUsed="1"/>
+    <w:lsdException w:name="Outline List 2" w:semiHidden="1" w:unhideWhenUsed="1"/>
+    <w:lsdException w:name="Outline List 3" w:semiHidden="1" w:unhideWhenUsed="1"/>
+    <w:lsdException w:name="Table Simple 1" w:semiHidden="1" w:unhideWhenUsed="1"/>
+    <w:lsdException w:name="Table Simple 2" w:semiHidden="1" w:unhideWhenUsed="1"/>
+    <w:lsdException w:name="Table Simple 3" w:semiHidden="1" w:unhideWhenUsed="1"/>
+    <w:lsdException w:name="Table Classic 1" w:semiHidden="1" w:unhideWhenUsed="1"/>
+    <w:lsdException w:name="Table Classic 2" w:semiHidden="1" w:unhideWhenUsed="1"/>
+    <w:lsdException w:name="Table Classic 3" w:semiHidden="1" w:unhideWhenUsed="1"/>
+    <w:lsdException w:name="Table Classic 4" w:semiHidden="1" w:unhideWhenUsed="1"/>
+    <w:lsdException w:name="Table Colorful 1" w:semiHidden="1" w:unhideWhenUsed="1"/>
+    <w:lsdException w:name="Table Colorful 2" w:semiHidden="1" w:unhideWhenUsed="1"/>
+    <w:lsdException w:name="Table Colorful 3" w:semiHidden="1" w:unhideWhenUsed="1"/>
+    <w:lsdException w:name="Table Columns 1" w:semiHidden="1" w:unhideWhenUsed="1"/>
+    <w:lsdException w:name="Table Columns 2" w:semiHidden="1" w:unhideWhenUsed="1"/>
+    <w:lsdException w:name="Table Columns 3" w:semiHidden="1" w:unhideWhenUsed="1"/>
+    <w:lsdException w:name="Table Columns 4" w:semiHidden="1" w:unhideWhenUsed="1"/>
+    <w:lsdException w:name="Table Columns 5" w:semiHidden="1" w:unhideWhenUsed="1"/>
+    <w:lsdException w:name="Table Grid 1" w:semiHidden="1" w:unhideWhenUsed="1"/>
+    <w:lsdException w:name="Table Grid 2" w:semiHidden="1" w:unhideWhenUsed="1"/>
+    <w:lsdException w:name="Table Grid 3" w:semiHidden="1" w:unhideWhenUsed="1"/>
+    <w:lsdException w:name="Table Grid 4" w:semiHidden="1" w:unhideWhenUsed="1"/>
+    <w:lsdException w:name="Table Grid 5" w:semiHidden="1" w:unhideWhenUsed="1"/>
+    <w:lsdException w:name="Table Grid 6" w:semiHidden="1" w:unhideWhenUsed="1"/>
+    <w:lsdException w:name="Table Grid 7" w:semiHidden="1" w:unhideWhenUsed="1"/>
+    <w:lsdException w:name="Table Grid 8" w:semiHidden="1" w:unhideWhenUsed="1"/>
+    <w:lsdException w:name="Table List 1" w:semiHidden="1" w:unhideWhenUsed="1"/>
+    <w:lsdException w:name="Table List 2" w:semiHidden="1" w:unhideWhenUsed="1"/>
+    <w:lsdException w:name="Table List 3" w:semiHidden="1" w:unhideWhenUsed="1"/>
+    <w:lsdException w:name="Table List 4" w:semiHidden="1" w:unhideWhenUsed="1"/>
+    <w:lsdException w:name="Table List 5" w:semiHidden="1" w:unhideWhenUsed="1"/>
+    <w:lsdException w:name="Table List 6" w:semiHidden="1" w:unhideWhenUsed="1"/>
+    <w:lsdException w:name="Table List 7" w:semiHidden="1" w:unhideWhenUsed="1"/>
+    <w:lsdException w:name="Table List 8" w:semiHidden="1" w:unhideWhenUsed="1"/>
+    <w:lsdException w:name="Table 3D effects 1" w:semiHidden="1" w:unhideWhenUsed="1"/>
+    <w:lsdException w:name="Table 3D effects 2" w:semiHidden="1" w:unhideWhenUsed="1"/>
+    <w:lsdException w:name="Table 3D effects 3" w:semiHidden="1" w:unhideWhenUsed="1"/>
+    <w:lsdException w:name="Table Contemporary" w:semiHidden="1" w:unhideWhenUsed="1"/>
+    <w:lsdException w:name="Table Elegant" w:semiHidden="1" w:unhideWhenUsed="1"/>
+    <w:lsdException w:name="Table Professional" w:semiHidden="1" w:unhideWhenUsed="1"/>
+    <w:lsdException w:name="Table Subtle 1" w:semiHidden="1" w:unhideWhenUsed="1"/>
+    <w:lsdException w:name="Table Subtle 2" w:semiHidden="1" w:unhideWhenUsed="1"/>
+    <w:lsdException w:name="Table Web 1" w:semiHidden="1" w:unhideWhenUsed="1"/>
+    <w:lsdException w:name="Table Web 2" w:semiHidden="1" w:unhideWhenUsed="1"/>
+    <w:lsdException w:name="Table Web 3" w:semiHidden="1" w:unhideWhenUsed="1"/>
+    <w:lsdException w:name="Balloon Text" w:semiHidden="1" w:unhideWhenUsed="1"/>
+    <w:lsdException w:name="Table Grid" w:uiPriority="39"/>
+    <w:lsdException w:name="Table Theme" w:semiHidden="1" w:unhideWhenUsed="1"/>
+    <w:lsdException w:name="Placeholder Text" w:semiHidden="1"/>
+    <w:lsdException w:name="No Spacing" w:uiPriority="1" w:qFormat="1"/>
+    <w:lsdException w:name="Light Shading" w:uiPriority="60"/>
+    <w:lsdException w:name="Light List" w:uiPriority="61"/>
+    <w:lsdException w:name="Light Grid" w:uiPriority="62"/>
+    <w:lsdException w:name="Medium Shading 1" w:uiPriority="63"/>
+    <w:lsdException w:name="Medium Shading 2" w:uiPriority="64"/>
+    <w:lsdException w:name="Medium List 1" w:uiPriority="65"/>
+    <w:lsdException w:name="Medium List 2" w:uiPriority="66"/>
+    <w:lsdException w:name="Medium Grid 1" w:uiPriority="67"/>
+    <w:lsdException w:name="Medium Grid 2" w:uiPriority="68"/>
+    <w:lsdException w:name="Medium Grid 3" w:uiPriority="69"/>
+    <w:lsdException w:name="Dark List" w:uiPriority="70"/>
+    <w:lsdException w:name="Colorful Shading" w:uiPriority="71"/>
+    <w:lsdException w:name="Colorful List" w:uiPriority="72"/>
+    <w:lsdException w:name="Colorful Grid" w:uiPriority="73"/>
+    <w:lsdException w:name="Light Shading Accent 1" w:uiPriority="60"/>
+    <w:lsdException w:name="Light List Accent 1" w:uiPriority="61"/>
+    <w:lsdException w:name="Light Grid Accent 1" w:uiPriority="62"/>
+    <w:lsdException w:name="Medium Shading 1 Accent 1" w:uiPriority="63"/>
+    <w:lsdException w:name="Medium Shading 2 Accent 1" w:uiPriority="64"/>
+    <w:lsdException w:name="Medium List 1 Accent 1" w:uiPriority="65"/>
+    <w:lsdException w:name="Revision" w:semiHidden="1"/>
+    <w:lsdException w:name="List Paragraph" w:uiPriority="34" w:qFormat="1"/>
+    <w:lsdException w:name="Quote" w:uiPriority="29" w:qFormat="1"/>
+    <w:lsdException w:name="Intense Quote" w:uiPriority="30" w:qFormat="1"/>
+    <w:lsdException w:name="Medium List 2 Accent 1" w:uiPriority="66"/>
+    <w:lsdException w:name="Medium Grid 1 Accent 1" w:uiPriority="67"/>
+    <w:lsdException w:name="Medium Grid 2 Accent 1" w:uiPriority="68"/>
+    <w:lsdException w:name="Medium Grid 3 Accent 1" w:uiPriority="69"/>
+    <w:lsdException w:name="Dark List Accent 1" w:uiPriority="70"/>
+    <w:lsdException w:name="Colorful Shading Accent 1" w:uiPriority="71"/>
+    <w:lsdException w:name="Colorful List Accent 1" w:uiPriority="72"/>
+    <w:lsdException w:name="Colorful Grid Accent 1" w:uiPriority="73"/>
+    <w:lsdException w:name="Light Shading Accent 2" w:uiPriority="60"/>
+    <w:lsdException w:name="Light List Accent 2" w:uiPriority="61"/>
+    <w:lsdException w:name="Light Grid Accent 2" w:uiPriority="62"/>
+    <w:lsdException w:name="Medium Shading 1 Accent 2" w:uiPriority="63"/>
+    <w:lsdException w:name="Medium Shading 2 Accent 2" w:uiPriority="64"/>
+    <w:lsdException w:name="Medium List 1 Accent 2" w:uiPriority="65"/>
+    <w:lsdException w:name="Medium List 2 Accent 2" w:uiPriority="66"/>
+    <w:lsdException w:name="Medium Grid 1 Accent 2" w:uiPriority="67"/>
+    <w:lsdException w:name="Medium Grid 2 Accent 2" w:uiPriority="68"/>
+    <w:lsdException w:name="Medium Grid 3 Accent 2" w:uiPriority="69"/>
+    <w:lsdException w:name="Dark List Accent 2" w:uiPriority="70"/>
+    <w:lsdException w:name="Colorful Shading Accent 2" w:uiPriority="71"/>
+    <w:lsdException w:name="Colorful List Accent 2" w:uiPriority="72"/>
+    <w:lsdException w:name="Colorful Grid Accent 2" w:uiPriority="73"/>
+    <w:lsdException w:name="Light Shading Accent 3" w:uiPriority="60"/>
+    <w:lsdException w:name="Light List Accent 3" w:uiPriority="61"/>
+    <w:lsdException w:name="Light Grid Accent 3" w:uiPriority="62"/>
+    <w:lsdException w:name="Medium Shading 1 Accent 3" w:uiPriority="63"/>
+    <w:lsdException w:name="Medium Shading 2 Accent 3" w:uiPriority="64"/>
+    <w:lsdException w:name="Medium List 1 Accent 3" w:uiPriority="65"/>
+    <w:lsdException w:name="Medium List 2 Accent 3" w:uiPriority="66"/>
+    <w:lsdException w:name="Medium Grid 1 Accent 3" w:uiPriority="67"/>
+    <w:lsdException w:name="Medium Grid 2 Accent 3" w:uiPriority="68"/>
+    <w:lsdException w:name="Medium Grid 3 Accent 3" w:uiPriority="69"/>
+    <w:lsdException w:name="Dark List Accent 3" w:uiPriority="70"/>
+    <w:lsdException w:name="Colorful Shading Accent 3" w:uiPriority="71"/>
+    <w:lsdException w:name="Colorful List Accent 3" w:uiPriority="72"/>
+    <w:lsdException w:name="Colorful Grid Accent 3" w:uiPriority="73"/>
+    <w:lsdException w:name="Light Shading Accent 4" w:uiPriority="60"/>
+    <w:lsdException w:name="Light List Accent 4" w:uiPriority="61"/>
+    <w:lsdException w:name="Light Grid Accent 4" w:uiPriority="62"/>
+    <w:lsdException w:name="Medium Shading 1 Accent 4" w:uiPriority="63"/>
+    <w:lsdException w:name="Medium Shading 2 Accent 4" w:uiPriority="64"/>
+    <w:lsdException w:name="Medium List 1 Accent 4" w:uiPriority="65"/>
+    <w:lsdException w:name="Medium List 2 Accent 4" w:uiPriority="66"/>
+    <w:lsdException w:name="Medium Grid 1 Accent 4" w:uiPriority="67"/>
+    <w:lsdException w:name="Medium Grid 2 Accent 4" w:uiPriority="68"/>
+    <w:lsdException w:name="Medium Grid 3 Accent 4" w:uiPriority="69"/>
+    <w:lsdException w:name="Dark List Accent 4" w:uiPriority="70"/>
+    <w:lsdException w:name="Colorful Shading Accent 4" w:uiPriority="71"/>
+    <w:lsdException w:name="Colorful List Accent 4" w:uiPriority="72"/>
+    <w:lsdException w:name="Colorful Grid Accent 4" w:uiPriority="73"/>
+    <w:lsdException w:name="Light Shading Accent 5" w:uiPriority="60"/>
+    <w:lsdException w:name="Light List Accent 5" w:uiPriority="61"/>
+    <w:lsdException w:name="Light Grid Accent 5" w:uiPriority="62"/>
+    <w:lsdException w:name="Medium Shading 1 Accent 5" w:uiPriority="63"/>
+    <w:lsdException w:name="Medium Shading 2 Accent 5" w:uiPriority="64"/>
+    <w:lsdException w:name="Medium List 1 Accent 5" w:uiPriority="65"/>
+    <w:lsdException w:name="Medium List 2 Accent 5" w:uiPriority="66"/>
+    <w:lsdException w:name="Medium Grid 1 Accent 5" w:uiPriority="67"/>
+    <w:lsdException w:name="Medium Grid 2 Accent 5" w:uiPriority="68"/>
+    <w:lsdException w:name="Medium Grid 3 Accent 5" w:uiPriority="69"/>
+    <w:lsdException w:name="Dark List Accent 5" w:uiPriority="70"/>
+    <w:lsdException w:name="Colorful Shading Accent 5" w:uiPriority="71"/>
+    <w:lsdException w:name="Colorful List Accent 5" w:uiPriority="72"/>
+    <w:lsdException w:name="Colorful Grid Accent 5" w:uiPriority="73"/>
+    <w:lsdException w:name="Light Shading Accent 6" w:uiPriority="60"/>
+    <w:lsdException w:name="Light List Accent 6" w:uiPriority="61"/>
+    <w:lsdException w:name="Light Grid Accent 6" w:uiPriority="62"/>
+    <w:lsdException w:name="Medium Shading 1 Accent 6" w:uiPriority="63"/>
+    <w:lsdException w:name="Medium Shading 2 Accent 6" w:uiPriority="64"/>
+    <w:lsdException w:name="Medium List 1 Accent 6" w:uiPriority="65"/>
+    <w:lsdException w:name="Medium List 2 Accent 6" w:uiPriority="66"/>
+    <w:lsdException w:name="Medium Grid 1 Accent 6" w:uiPriority="67"/>
+    <w:lsdException w:name="Medium Grid 2 Accent 6" w:uiPriority="68"/>
+    <w:lsdException w:name="Medium Grid 3 Accent 6" w:uiPriority="69"/>
+    <w:lsdException w:name="Dark List Accent 6" w:uiPriority="70"/>
+    <w:lsdException w:name="Colorful Shading Accent 6" w:uiPriority="71"/>
+    <w:lsdException w:name="Colorful List Accent 6" w:uiPriority="72"/>
+    <w:lsdException w:name="Colorful Grid Accent 6" w:uiPriority="73"/>
+    <w:lsdException w:name="Subtle Emphasis" w:uiPriority="19" w:qFormat="1"/>
+    <w:lsdException w:name="Intense Emphasis" w:uiPriority="21" w:qFormat="1"/>
+    <w:lsdException w:name="Subtle Reference" w:uiPriority="31" w:qFormat="1"/>
+    <w:lsdException w:name="Intense Reference" w:uiPriority="32" w:qFormat="1"/>
+    <w:lsdException w:name="Book Title" w:uiPriority="33" w:qFormat="1"/>
+    <w:lsdException w:name="Bibliography" w:semiHidden="1" w:uiPriority="37" w:unhideWhenUsed="1"/>
+    <w:lsdException w:name="TOC Heading" w:semiHidden="1" w:uiPriority="39" w:unhideWhenUsed="1" w:qFormat="1"/>
+    <w:lsdException w:name="Plain Table 1" w:uiPriority="41"/>
+    <w:lsdException w:name="Plain Table 2" w:uiPriority="42"/>
+    <w:lsdException w:name="Plain Table 3" w:uiPriority="43"/>
+    <w:lsdException w:name="Plain Table 4" w:uiPriority="44"/>
+    <w:lsdException w:name="Plain Table 5" w:uiPriority="45"/>
+    <w:lsdException w:name="Grid Table Light" w:uiPriority="40"/>
+    <w:lsdException w:name="Grid Table 1 Light" w:uiPriority="46"/>
+    <w:lsdException w:name="Grid Table 2" w:uiPriority="47"/>
+    <w:lsdException w:name="Grid Table 3" w:uiPriority="48"/>
+    <w:lsdException w:name="Grid Table 4" w:uiPriority="49"/>
+    <w:lsdException w:name="Grid Table 5 Dark" w:uiPriority="50"/>
+    <w:lsdException w:name="Grid Table 6 Colorful" w:uiPriority="51"/>
+    <w:lsdException w:name="Grid Table 7 Colorful" w:uiPriority="52"/>
+    <w:lsdException w:name="Grid Table 1 Light Accent 1" w:uiPriority="46"/>
+    <w:lsdException w:name="Grid Table 2 Accent 1" w:uiPriority="47"/>
+    <w:lsdException w:name="Grid Table 3 Accent 1" w:uiPriority="48"/>
+    <w:lsdException w:name="Grid Table 4 Accent 1" w:uiPriority="49"/>
+    <w:lsdException w:name="Grid Table 5 Dark Accent 1" w:uiPriority="50"/>
+    <w:lsdException w:name="Grid Table 6 Colorful Accent 1" w:uiPriority="51"/>
+    <w:lsdException w:name="Grid Table 7 Colorful Accent 1" w:uiPriority="52"/>
+    <w:lsdException w:name="Grid Table 1 Light Accent 2" w:uiPriority="46"/>
+    <w:lsdException w:name="Grid Table 2 Accent 2" w:uiPriority="47"/>
+    <w:lsdException w:name="Grid Table 3 Accent 2" w:uiPriority="48"/>
+    <w:lsdException w:name="Grid Table 4 Accent 2" w:uiPriority="49"/>
+    <w:lsdException w:name="Grid Table 5 Dark Accent 2" w:uiPriority="50"/>
+    <w:lsdException w:name="Grid Table 6 Colorful Accent 2" w:uiPriority="51"/>
+    <w:lsdException w:name="Grid Table 7 Colorful Accent 2" w:uiPriority="52"/>
+    <w:lsdException w:name="Grid Table 1 Light Accent 3" w:uiPriority="46"/>
+    <w:lsdException w:name="Grid Table 2 Accent 3" w:uiPriority="47"/>
+    <w:lsdException w:name="Grid Table 3 Accent 3" w:uiPriority="48"/>
+    <w:lsdException w:name="Grid Table 4 Accent 3" w:uiPriority="49"/>
+    <w:lsdException w:name="Grid Table 5 Dark Accent 3" w:uiPriority="50"/>
+    <w:lsdException w:name="Grid Table 6 Colorful Accent 3" w:uiPriority="51"/>
+    <w:lsdException w:name="Grid Table 7 Colorful Accent 3" w:uiPriority="52"/>
+    <w:lsdException w:name="Grid Table 1 Light Accent 4" w:uiPriority="46"/>
+    <w:lsdException w:name="Grid Table 2 Accent 4" w:uiPriority="47"/>
+    <w:lsdException w:name="Grid Table 3 Accent 4" w:uiPriority="48"/>
+    <w:lsdException w:name="Grid Table 4 Accent 4" w:uiPriority="49"/>
+    <w:lsdException w:name="Grid Table 5 Dark Accent 4" w:uiPriority="50"/>
+    <w:lsdException w:name="Grid Table 6 Colorful Accent 4" w:uiPriority="51"/>
+    <w:lsdException w:name="Grid Table 7 Colorful Accent 4" w:uiPriority="52"/>
+    <w:lsdException w:name="Grid Table 1 Light Accent 5" w:uiPriority="46"/>
+    <w:lsdException w:name="Grid Table 2 Accent 5" w:uiPriority="47"/>
+    <w:lsdException w:name="Grid Table 3 Accent 5" w:uiPriority="48"/>
+    <w:lsdException w:name="Grid Table 4 Accent 5" w:uiPriority="49"/>
+    <w:lsdException w:name="Grid Table 5 Dark Accent 5" w:uiPriority="50"/>
+    <w:lsdException w:name="Grid Table 6 Colorful Accent 5" w:uiPriority="51"/>
+    <w:lsdException w:name="Grid Table 7 Colorful Accent 5" w:uiPriority="52"/>
+    <w:lsdException w:name="Grid Table 1 Light Accent 6" w:uiPriority="46"/>
+    <w:lsdException w:name="Grid Table 2 Accent 6" w:uiPriority="47"/>
+    <w:lsdException w:name="Grid Table 3 Accent 6" w:uiPriority="48"/>
+    <w:lsdException w:name="Grid Table 4 Accent 6" w:uiPriority="49"/>
+    <w:lsdException w:name="Grid Table 5 Dark Accent 6" w:uiPriority="50"/>
+    <w:lsdException w:name="Grid Table 6 Colorful Accent 6" w:uiPriority="51"/>
+    <w:lsdException w:name="Grid Table 7 Colorful Accent 6" w:uiPriority="52"/>
+    <w:lsdException w:name="List Table 1 Light" w:uiPriority="46"/>
+    <w:lsdException w:name="List Table 2" w:uiPriority="47"/>
+    <w:lsdException w:name="List Table 3" w:uiPriority="48"/>
+    <w:lsdException w:name="List Table 4" w:uiPriority="49"/>
+    <w:lsdException w:name="List Table 5 Dark" w:uiPriority="50"/>
+    <w:lsdException w:name="List Table 6 Colorful" w:uiPriority="51"/>
+    <w:lsdException w:name="List Table 7 Colorful" w:uiPriority="52"/>
+    <w:lsdException w:name="List Table 1 Light Accent 1" w:uiPriority="46"/>
+    <w:lsdException w:name="List Table 2 Accent 1" w:uiPriority="47"/>
+    <w:lsdException w:name="List Table 3 Accent 1" w:uiPriority="48"/>
+    <w:lsdException w:name="List Table 4 Accent 1" w:uiPriority="49"/>
+    <w:lsdException w:name="List Table 5 Dark Accent 1" w:uiPriority="50"/>
+    <w:lsdException w:name="List Table 6 Colorful Accent 1" w:uiPriority="51"/>
+    <w:lsdException w:name="List Table 7 Colorful Accent 1" w:uiPriority="52"/>
+    <w:lsdException w:name="List Table 1 Light Accent 2" w:uiPriority="46"/>
+    <w:lsdException w:name="List Table 2 Accent 2" w:uiPriority="47"/>
+    <w:lsdException w:name="List Table 3 Accent 2" w:uiPriority="48"/>
+    <w:lsdException w:name="List Table 4 Accent 2" w:uiPriority="49"/>
+    <w:lsdException w:name="List Table 5 Dark Accent 2" w:uiPriority="50"/>
+    <w:lsdException w:name="List Table 6 Colorful Accent 2" w:uiPriority="51"/>
+    <w:lsdException w:name="List Table 7 Colorful Accent 2" w:uiPriority="52"/>
+    <w:lsdException w:name="List Table 1 Light Accent 3" w:uiPriority="46"/>
+    <w:lsdException w:name="List Table 2 Accent 3" w:uiPriority="47"/>
+    <w:lsdException w:name="List Table 3 Accent 3" w:uiPriority="48"/>
+    <w:lsdException w:name="List Table 4 Accent 3" w:uiPriority="49"/>
+    <w:lsdException w:name="List Table 5 Dark Accent 3" w:uiPriority="50"/>
+    <w:lsdException w:name="List Table 6 Colorful Accent 3" w:uiPriority="51"/>
+    <w:lsdException w:name="List Table 7 Colorful Accent 3" w:uiPriority="52"/>
+    <w:lsdException w:name="List Table 1 Light Accent 4" w:uiPriority="46"/>
+    <w:lsdException w:name="List Table 2 Accent 4" w:uiPriority="47"/>
+    <w:lsdException w:name="List Table 3 Accent 4" w:uiPriority="48"/>
+    <w:lsdException w:name="List Table 4 Accent 4" w:uiPriority="49"/>
+    <w:lsdException w:name="List Table 5 Dark Accent 4" w:uiPriority="50"/>
+    <w:lsdException w:name="List Table 6 Colorful Accent 4" w:uiPriority="51"/>
+    <w:lsdException w:name="List Table 7 Colorful Accent 4" w:uiPriority="52"/>
+    <w:lsdException w:name="List Table 1 Light Accent 5" w:uiPriority="46"/>
+    <w:lsdException w:name="List Table 2 Accent 5" w:uiPriority="47"/>
+    <w:lsdException w:name="List Table 3 Accent 5" w:uiPriority="48"/>
+    <w:lsdException w:name="List Table 4 Accent 5" w:uiPriority="49"/>
+    <w:lsdException w:name="List Table 5 Dark Accent 5" w:uiPriority="50"/>
+    <w:lsdException w:name="List Table 6 Colorful Accent 5" w:uiPriority="51"/>
+    <w:lsdException w:name="List Table 7 Colorful Accent 5" w:uiPriority="52"/>
+    <w:lsdException w:name="List Table 1 Light Accent 6" w:uiPriority="46"/>
+    <w:lsdException w:name="List Table 2 Accent 6" w:uiPriority="47"/>
+    <w:lsdException w:name="List Table 3 Accent 6" w:uiPriority="48"/>
+    <w:lsdException w:name="List Table 4 Accent 6" w:uiPriority="49"/>
+    <w:lsdException w:name="List Table 5 Dark Accent 6" w:uiPriority="50"/>
+    <w:lsdException w:name="List Table 6 Colorful Accent 6" w:uiPriority="51"/>
+    <w:lsdException w:name="List Table 7 Colorful Accent 6" w:uiPriority="52"/>
+    <w:lsdException w:name="Mention" w:semiHidden="1" w:unhideWhenUsed="1"/>
+    <w:lsdException w:name="Smart Hyperlink" w:semiHidden="1" w:unhideWhenUsed="1"/>
+    <w:lsdException w:name="Hashtag" w:semiHidden="1" w:unhideWhenUsed="1"/>
+    <w:lsdException w:name="Unresolved Mention" w:semiHidden="1" w:unhideWhenUsed="1"/>
+    <w:lsdException w:name="Smart Link" w:semiHidden="1" w:unhideWhenUsed="1"/>
+  </w:latentStyles>
+  <w:style w:type="paragraph" w:default="1" w:styleId="Normal">
+    <w:name w:val="Normal"/>
+    <w:qFormat/>
+  </w:style>
+  <w:style w:type="paragraph" w:styleId="Heading1">
+    <w:name w:val="heading 1"/>
+    <w:uiPriority w:val="9"/>
+    <w:qFormat/>
+    <w:pPr>
+      <w:outlineLvl w:val="0"/>
+    </w:pPr>
+    <w:rPr>
+      <w:b/>
+      <w:bCs/>
+      <w:sz w:val="30"/>
+      <w:szCs w:val="30"/>
+    </w:rPr>
+  </w:style>
+  <w:style w:type="paragraph" w:styleId="Heading2">
+    <w:name w:val="heading 2"/>
+    <w:uiPriority w:val="9"/>
+    <w:semiHidden/>
+    <w:unhideWhenUsed/>
+    <w:qFormat/>
+    <w:pPr>
+      <w:outlineLvl w:val="1"/>
+    </w:pPr>
+    <w:rPr>
+      <w:color w:val="2E74B5"/>
+      <w:sz w:val="26"/>
+      <w:szCs w:val="26"/>
+    </w:rPr>
+  </w:style>
+  <w:style w:type="paragraph" w:styleId="Heading3">
+    <w:name w:val="heading 3"/>
+    <w:uiPriority w:val="9"/>
+    <w:semiHidden/>
+    <w:unhideWhenUsed/>
+    <w:qFormat/>
+    <w:pPr>
+      <w:outlineLvl w:val="2"/>
+    </w:pPr>
+    <w:rPr>
+      <w:color w:val="1F4D78"/>
+      <w:sz w:val="24"/>
+      <w:szCs w:val="24"/>
+    </w:rPr>
+  </w:style>
+  <w:style w:type="paragraph" w:styleId="Heading4">
+    <w:name w:val="heading 4"/>
+    <w:uiPriority w:val="9"/>
+    <w:semiHidden/>
+    <w:unhideWhenUsed/>
+    <w:qFormat/>
+    <w:pPr>
+      <w:outlineLvl w:val="3"/>
+    </w:pPr>
+    <w:rPr>
+      <w:i/>
+      <w:iCs/>
+      <w:color w:val="2E74B5"/>
+    </w:rPr>
+  </w:style>
+  <w:style w:type="paragraph" w:styleId="Heading5">
+    <w:name w:val="heading 5"/>
+    <w:uiPriority w:val="9"/>
+    <w:semiHidden/>
+    <w:unhideWhenUsed/>
+    <w:qFormat/>
+    <w:pPr>
+      <w:outlineLvl w:val="4"/>
+    </w:pPr>
+    <w:rPr>
+      <w:color w:val="2E74B5"/>
+    </w:rPr>
+  </w:style>
+  <w:style w:type="paragraph" w:styleId="Heading6">
+    <w:name w:val="heading 6"/>
+    <w:uiPriority w:val="9"/>
+    <w:semiHidden/>
+    <w:unhideWhenUsed/>
+    <w:qFormat/>
+    <w:pPr>
+      <w:outlineLvl w:val="5"/>
+    </w:pPr>
+    <w:rPr>
+      <w:color w:val="1F4D78"/>
+    </w:rPr>
+  </w:style>
+  <w:style w:type="character" w:default="1" w:styleId="DefaultParagraphFont">
+    <w:name w:val="Default Paragraph Font"/>
+    <w:uiPriority w:val="1"/>
+    <w:semiHidden/>
+    <w:unhideWhenUsed/>
+  </w:style>
+  <w:style w:type="table" w:default="1" w:styleId="TableNormal">
+    <w:name w:val="Normal Table"/>
+    <w:uiPriority w:val="99"/>
+    <w:semiHidden/>
+    <w:unhideWhenUsed/>
+    <w:tblPr>
+      <w:tblInd w:w="0" w:type="dxa"/>
+      <w:tblCellMar>
+        <w:top w:w="0" w:type="dxa"/>
+        <w:left w:w="108" w:type="dxa"/>
+        <w:bottom w:w="0" w:type="dxa"/>
+        <w:right w:w="108" w:type="dxa"/>
+      </w:tblCellMar>
+    </w:tblPr>
+  </w:style>
+  <w:style w:type="numbering" w:default="1" w:styleId="NoList">
+    <w:name w:val="No List"/>
+    <w:uiPriority w:val="99"/>
+    <w:semiHidden/>
+    <w:unhideWhenUsed/>
+  </w:style>
   <w:style w:type="paragraph" w:styleId="Title">
     <w:name w:val="Title"/>
-    <w:basedOn w:val="Normal"/>
-    <w:next w:val="Normal"/>
+    <w:uiPriority w:val="10"/>
     <w:qFormat/>
     <w:rPr>
       <w:sz w:val="56"/>
       <w:szCs w:val="56"/>
     </w:rPr>
   </w:style>
-  <w:style w:type="paragraph" w:styleId="Heading1">
-    <w:name w:val="Heading 1"/>
-    <w:basedOn w:val="Normal"/>
-    <w:next w:val="Normal"/>
-    <w:qFormat/>
-    <w:rPr>
-      <w:rFonts w:ascii="Calibri" w:cs="Calibri" w:eastAsia="Calibri" w:hAnsi="Calibri"/>
-      <w:b/>
-      <w:bCs/>
-      <w:color w:val="111D1B"/>
-      <w:sz w:val="30"/>
-      <w:szCs w:val="30"/>
-    </w:rPr>
-  </w:style>
-  <w:style w:type="paragraph" w:styleId="Heading2">
-    <w:name w:val="Heading 2"/>
-    <w:basedOn w:val="Normal"/>
-    <w:next w:val="Normal"/>
-    <w:qFormat/>
-    <w:rPr>
-      <w:color w:val="2E74B5"/>
-      <w:sz w:val="26"/>
-      <w:szCs w:val="26"/>
-    </w:rPr>
-  </w:style>
-  <w:style w:type="paragraph" w:styleId="Heading3">
-    <w:name w:val="Heading 3"/>
-    <w:basedOn w:val="Normal"/>
-    <w:next w:val="Normal"/>
-    <w:qFormat/>
-    <w:rPr>
-      <w:color w:val="1F4D78"/>
-      <w:sz w:val="24"/>
-      <w:szCs w:val="24"/>
-    </w:rPr>
-  </w:style>
-  <w:style w:type="paragraph" w:styleId="Heading4">
-    <w:name w:val="Heading 4"/>
-    <w:basedOn w:val="Normal"/>
-    <w:next w:val="Normal"/>
-    <w:qFormat/>
-    <w:rPr>
-      <w:i/>
-      <w:iCs/>
-      <w:color w:val="2E74B5"/>
-    </w:rPr>
-  </w:style>
-  <w:style w:type="paragraph" w:styleId="Heading5">
-    <w:name w:val="Heading 5"/>
-    <w:basedOn w:val="Normal"/>
-    <w:next w:val="Normal"/>
-    <w:qFormat/>
-    <w:rPr>
-      <w:color w:val="2E74B5"/>
-    </w:rPr>
-  </w:style>
-  <w:style w:type="paragraph" w:styleId="Heading6">
-    <w:name w:val="Heading 6"/>
-    <w:basedOn w:val="Normal"/>
-    <w:next w:val="Normal"/>
-    <w:qFormat/>
-    <w:rPr>
-      <w:color w:val="1F4D78"/>
-    </w:rPr>
-  </w:style>
-  <w:style w:type="paragraph" w:styleId="Strong">
-    <w:name w:val="Strong"/>
-    <w:basedOn w:val="Normal"/>
-    <w:next w:val="Normal"/>
+  <w:style w:type="paragraph" w:customStyle="1" w:styleId="Strong1">
+    <w:name w:val="Strong1"/>
     <w:qFormat/>
     <w:rPr>
       <w:b/>
@@ -1005,12 +1337,10 @@
   </w:style>
   <w:style w:type="paragraph" w:styleId="ListParagraph">
     <w:name w:val="List Paragraph"/>
-    <w:basedOn w:val="Normal"/>
     <w:qFormat/>
   </w:style>
   <w:style w:type="character" w:styleId="Hyperlink">
     <w:name w:val="Hyperlink"/>
-    <w:basedOn w:val="DefaultParagraphFont"/>
     <w:uiPriority w:val="99"/>
     <w:unhideWhenUsed/>
     <w:rPr>
@@ -1020,7 +1350,6 @@
   </w:style>
   <w:style w:type="character" w:styleId="FootnoteReference">
     <w:name w:val="footnote reference"/>
-    <w:basedOn w:val="DefaultParagraphFont"/>
     <w:uiPriority w:val="99"/>
     <w:semiHidden/>
     <w:unhideWhenUsed/>
@@ -1030,22 +1359,17 @@
   </w:style>
   <w:style w:type="paragraph" w:styleId="FootnoteText">
     <w:name w:val="footnote text"/>
-    <w:basedOn w:val="Normal"/>
     <w:link w:val="FootnoteTextChar"/>
     <w:uiPriority w:val="99"/>
     <w:semiHidden/>
     <w:unhideWhenUsed/>
-    <w:pPr>
-      <w:spacing w:after="0" w:line="240" w:lineRule="auto"/>
-    </w:pPr>
     <w:rPr>
       <w:sz w:val="20"/>
       <w:szCs w:val="20"/>
     </w:rPr>
   </w:style>
-  <w:style w:type="character" w:styleId="FootnoteTextChar">
+  <w:style w:type="character" w:customStyle="1" w:styleId="FootnoteTextChar">
     <w:name w:val="Footnote Text Char"/>
-    <w:basedOn w:val="DefaultParagraphFont"/>
     <w:link w:val="FootnoteText"/>
     <w:uiPriority w:val="99"/>
     <w:semiHidden/>
@@ -1057,7 +1381,6 @@
   </w:style>
   <w:style w:type="character" w:styleId="EndnoteReference">
     <w:name w:val="endnote reference"/>
-    <w:basedOn w:val="DefaultParagraphFont"/>
     <w:uiPriority w:val="99"/>
     <w:semiHidden/>
     <w:unhideWhenUsed/>
@@ -1067,22 +1390,17 @@
   </w:style>
   <w:style w:type="paragraph" w:styleId="EndnoteText">
     <w:name w:val="endnote text"/>
-    <w:basedOn w:val="Normal"/>
     <w:link w:val="EndnoteTextChar"/>
     <w:uiPriority w:val="99"/>
     <w:semiHidden/>
     <w:unhideWhenUsed/>
-    <w:pPr>
-      <w:spacing w:after="0" w:line="240" w:lineRule="auto"/>
-    </w:pPr>
     <w:rPr>
       <w:sz w:val="20"/>
       <w:szCs w:val="20"/>
     </w:rPr>
   </w:style>
-  <w:style w:type="character" w:styleId="EndnoteTextChar">
+  <w:style w:type="character" w:customStyle="1" w:styleId="EndnoteTextChar">
     <w:name w:val="Endnote Text Char"/>
-    <w:basedOn w:val="DefaultParagraphFont"/>
     <w:link w:val="EndnoteText"/>
     <w:uiPriority w:val="99"/>
     <w:semiHidden/>
@@ -1093,4 +1411,299 @@
     </w:rPr>
   </w:style>
 </w:styles>
+</file>
+
+<file path=word/theme/theme1.xml><?xml version="1.0" encoding="utf-8"?>
+<a:theme xmlns:a="http://schemas.openxmlformats.org/drawingml/2006/main" name="Office Theme">
+  <a:themeElements>
+    <a:clrScheme name="Office">
+      <a:dk1>
+        <a:sysClr val="windowText" lastClr="000000"/>
+      </a:dk1>
+      <a:lt1>
+        <a:sysClr val="window" lastClr="FFFFFF"/>
+      </a:lt1>
+      <a:dk2>
+        <a:srgbClr val="44546A"/>
+      </a:dk2>
+      <a:lt2>
+        <a:srgbClr val="E7E6E6"/>
+      </a:lt2>
+      <a:accent1>
+        <a:srgbClr val="4472C4"/>
+      </a:accent1>
+      <a:accent2>
+        <a:srgbClr val="ED7D31"/>
+      </a:accent2>
+      <a:accent3>
+        <a:srgbClr val="A5A5A5"/>
+      </a:accent3>
+      <a:accent4>
+        <a:srgbClr val="FFC000"/>
+      </a:accent4>
+      <a:accent5>
+        <a:srgbClr val="5B9BD5"/>
+      </a:accent5>
+      <a:accent6>
+        <a:srgbClr val="70AD47"/>
+      </a:accent6>
+      <a:hlink>
+        <a:srgbClr val="0563C1"/>
+      </a:hlink>
+      <a:folHlink>
+        <a:srgbClr val="954F72"/>
+      </a:folHlink>
+    </a:clrScheme>
+    <a:fontScheme name="Office">
+      <a:majorFont>
+        <a:latin typeface="Calibri Light" panose="020F0302020204030204"/>
+        <a:ea typeface=""/>
+        <a:cs typeface=""/>
+        <a:font script="Jpan" typeface="游ゴシック Light"/>
+        <a:font script="Hang" typeface="맑은 고딕"/>
+        <a:font script="Hans" typeface="等线 Light"/>
+        <a:font script="Hant" typeface="新細明體"/>
+        <a:font script="Arab" typeface="Times New Roman"/>
+        <a:font script="Hebr" typeface="Times New Roman"/>
+        <a:font script="Thai" typeface="Angsana New"/>
+        <a:font script="Ethi" typeface="Nyala"/>
+        <a:font script="Beng" typeface="Vrinda"/>
+        <a:font script="Gujr" typeface="Shruti"/>
+        <a:font script="Khmr" typeface="MoolBoran"/>
+        <a:font script="Knda" typeface="Tunga"/>
+        <a:font script="Guru" typeface="Raavi"/>
+        <a:font script="Cans" typeface="Euphemia"/>
+        <a:font script="Cher" typeface="Plantagenet Cherokee"/>
+        <a:font script="Yiii" typeface="Microsoft Yi Baiti"/>
+        <a:font script="Tibt" typeface="Microsoft Himalaya"/>
+        <a:font script="Thaa" typeface="MV Boli"/>
+        <a:font script="Deva" typeface="Mangal"/>
+        <a:font script="Telu" typeface="Gautami"/>
+        <a:font script="Taml" typeface="Latha"/>
+        <a:font script="Syrc" typeface="Estrangelo Edessa"/>
+        <a:font script="Orya" typeface="Kalinga"/>
+        <a:font script="Mlym" typeface="Kartika"/>
+        <a:font script="Laoo" typeface="DokChampa"/>
+        <a:font script="Sinh" typeface="Iskoola Pota"/>
+        <a:font script="Mong" typeface="Mongolian Baiti"/>
+        <a:font script="Viet" typeface="Times New Roman"/>
+        <a:font script="Uigh" typeface="Microsoft Uighur"/>
+        <a:font script="Geor" typeface="Sylfaen"/>
+        <a:font script="Armn" typeface="Arial"/>
+        <a:font script="Bugi" typeface="Leelawadee UI"/>
+        <a:font script="Bopo" typeface="Microsoft JhengHei"/>
+        <a:font script="Java" typeface="Javanese Text"/>
+        <a:font script="Lisu" typeface="Segoe UI"/>
+        <a:font script="Mymr" typeface="Myanmar Text"/>
+        <a:font script="Nkoo" typeface="Ebrima"/>
+        <a:font script="Olck" typeface="Nirmala UI"/>
+        <a:font script="Osma" typeface="Ebrima"/>
+        <a:font script="Phag" typeface="Phagspa"/>
+        <a:font script="Syrn" typeface="Estrangelo Edessa"/>
+        <a:font script="Syrj" typeface="Estrangelo Edessa"/>
+        <a:font script="Syre" typeface="Estrangelo Edessa"/>
+        <a:font script="Sora" typeface="Nirmala UI"/>
+        <a:font script="Tale" typeface="Microsoft Tai Le"/>
+        <a:font script="Talu" typeface="Microsoft New Tai Lue"/>
+        <a:font script="Tfng" typeface="Ebrima"/>
+      </a:majorFont>
+      <a:minorFont>
+        <a:latin typeface="Calibri" panose="020F0502020204030204"/>
+        <a:ea typeface=""/>
+        <a:cs typeface=""/>
+        <a:font script="Jpan" typeface="游明朝"/>
+        <a:font script="Hang" typeface="맑은 고딕"/>
+        <a:font script="Hans" typeface="等线"/>
+        <a:font script="Hant" typeface="新細明體"/>
+        <a:font script="Arab" typeface="Arial"/>
+        <a:font script="Hebr" typeface="Arial"/>
+        <a:font script="Thai" typeface="Cordia New"/>
+        <a:font script="Ethi" typeface="Nyala"/>
+        <a:font script="Beng" typeface="Vrinda"/>
+        <a:font script="Gujr" typeface="Shruti"/>
+        <a:font script="Khmr" typeface="DaunPenh"/>
+        <a:font script="Knda" typeface="Tunga"/>
+        <a:font script="Guru" typeface="Raavi"/>
+        <a:font script="Cans" typeface="Euphemia"/>
+        <a:font script="Cher" typeface="Plantagenet Cherokee"/>
+        <a:font script="Yiii" typeface="Microsoft Yi Baiti"/>
+        <a:font script="Tibt" typeface="Microsoft Himalaya"/>
+        <a:font script="Thaa" typeface="MV Boli"/>
+        <a:font script="Deva" typeface="Mangal"/>
+        <a:font script="Telu" typeface="Gautami"/>
+        <a:font script="Taml" typeface="Latha"/>
+        <a:font script="Syrc" typeface="Estrangelo Edessa"/>
+        <a:font script="Orya" typeface="Kalinga"/>
+        <a:font script="Mlym" typeface="Kartika"/>
+        <a:font script="Laoo" typeface="DokChampa"/>
+        <a:font script="Sinh" typeface="Iskoola Pota"/>
+        <a:font script="Mong" typeface="Mongolian Baiti"/>
+        <a:font script="Viet" typeface="Arial"/>
+        <a:font script="Uigh" typeface="Microsoft Uighur"/>
+        <a:font script="Geor" typeface="Sylfaen"/>
+        <a:font script="Armn" typeface="Arial"/>
+        <a:font script="Bugi" typeface="Leelawadee UI"/>
+        <a:font script="Bopo" typeface="Microsoft JhengHei"/>
+        <a:font script="Java" typeface="Javanese Text"/>
+        <a:font script="Lisu" typeface="Segoe UI"/>
+        <a:font script="Mymr" typeface="Myanmar Text"/>
+        <a:font script="Nkoo" typeface="Ebrima"/>
+        <a:font script="Olck" typeface="Nirmala UI"/>
+        <a:font script="Osma" typeface="Ebrima"/>
+        <a:font script="Phag" typeface="Phagspa"/>
+        <a:font script="Syrn" typeface="Estrangelo Edessa"/>
+        <a:font script="Syrj" typeface="Estrangelo Edessa"/>
+        <a:font script="Syre" typeface="Estrangelo Edessa"/>
+        <a:font script="Sora" typeface="Nirmala UI"/>
+        <a:font script="Tale" typeface="Microsoft Tai Le"/>
+        <a:font script="Talu" typeface="Microsoft New Tai Lue"/>
+        <a:font script="Tfng" typeface="Ebrima"/>
+      </a:minorFont>
+    </a:fontScheme>
+    <a:fmtScheme name="Office">
+      <a:fillStyleLst>
+        <a:solidFill>
+          <a:schemeClr val="phClr"/>
+        </a:solidFill>
+        <a:gradFill rotWithShape="1">
+          <a:gsLst>
+            <a:gs pos="0">
+              <a:schemeClr val="phClr">
+                <a:lumMod val="110000"/>
+                <a:satMod val="105000"/>
+                <a:tint val="67000"/>
+              </a:schemeClr>
+            </a:gs>
+            <a:gs pos="50000">
+              <a:schemeClr val="phClr">
+                <a:lumMod val="105000"/>
+                <a:satMod val="103000"/>
+                <a:tint val="73000"/>
+              </a:schemeClr>
+            </a:gs>
+            <a:gs pos="100000">
+              <a:schemeClr val="phClr">
+                <a:lumMod val="105000"/>
+                <a:satMod val="109000"/>
+                <a:tint val="81000"/>
+              </a:schemeClr>
+            </a:gs>
+          </a:gsLst>
+          <a:lin ang="5400000" scaled="0"/>
+        </a:gradFill>
+        <a:gradFill rotWithShape="1">
+          <a:gsLst>
+            <a:gs pos="0">
+              <a:schemeClr val="phClr">
+                <a:satMod val="103000"/>
+                <a:lumMod val="102000"/>
+                <a:tint val="94000"/>
+              </a:schemeClr>
+            </a:gs>
+            <a:gs pos="50000">
+              <a:schemeClr val="phClr">
+                <a:satMod val="110000"/>
+                <a:lumMod val="100000"/>
+                <a:shade val="100000"/>
+              </a:schemeClr>
+            </a:gs>
+            <a:gs pos="100000">
+              <a:schemeClr val="phClr">
+                <a:lumMod val="99000"/>
+                <a:satMod val="120000"/>
+                <a:shade val="78000"/>
+              </a:schemeClr>
+            </a:gs>
+          </a:gsLst>
+          <a:lin ang="5400000" scaled="0"/>
+        </a:gradFill>
+      </a:fillStyleLst>
+      <a:lnStyleLst>
+        <a:ln w="6350" cap="flat" cmpd="sng" algn="ctr">
+          <a:solidFill>
+            <a:schemeClr val="phClr"/>
+          </a:solidFill>
+          <a:prstDash val="solid"/>
+          <a:miter lim="800000"/>
+        </a:ln>
+        <a:ln w="12700" cap="flat" cmpd="sng" algn="ctr">
+          <a:solidFill>
+            <a:schemeClr val="phClr"/>
+          </a:solidFill>
+          <a:prstDash val="solid"/>
+          <a:miter lim="800000"/>
+        </a:ln>
+        <a:ln w="19050" cap="flat" cmpd="sng" algn="ctr">
+          <a:solidFill>
+            <a:schemeClr val="phClr"/>
+          </a:solidFill>
+          <a:prstDash val="solid"/>
+          <a:miter lim="800000"/>
+        </a:ln>
+      </a:lnStyleLst>
+      <a:effectStyleLst>
+        <a:effectStyle>
+          <a:effectLst/>
+        </a:effectStyle>
+        <a:effectStyle>
+          <a:effectLst/>
+        </a:effectStyle>
+        <a:effectStyle>
+          <a:effectLst>
+            <a:outerShdw blurRad="57150" dist="19050" dir="5400000" algn="ctr" rotWithShape="0">
+              <a:srgbClr val="000000">
+                <a:alpha val="63000"/>
+              </a:srgbClr>
+            </a:outerShdw>
+          </a:effectLst>
+        </a:effectStyle>
+      </a:effectStyleLst>
+      <a:bgFillStyleLst>
+        <a:solidFill>
+          <a:schemeClr val="phClr"/>
+        </a:solidFill>
+        <a:solidFill>
+          <a:schemeClr val="phClr">
+            <a:tint val="95000"/>
+            <a:satMod val="170000"/>
+          </a:schemeClr>
+        </a:solidFill>
+        <a:gradFill rotWithShape="1">
+          <a:gsLst>
+            <a:gs pos="0">
+              <a:schemeClr val="phClr">
+                <a:tint val="93000"/>
+                <a:satMod val="150000"/>
+                <a:shade val="98000"/>
+                <a:lumMod val="102000"/>
+              </a:schemeClr>
+            </a:gs>
+            <a:gs pos="50000">
+              <a:schemeClr val="phClr">
+                <a:tint val="98000"/>
+                <a:satMod val="130000"/>
+                <a:shade val="90000"/>
+                <a:lumMod val="103000"/>
+              </a:schemeClr>
+            </a:gs>
+            <a:gs pos="100000">
+              <a:schemeClr val="phClr">
+                <a:shade val="63000"/>
+                <a:satMod val="120000"/>
+              </a:schemeClr>
+            </a:gs>
+          </a:gsLst>
+          <a:lin ang="5400000" scaled="0"/>
+        </a:gradFill>
+      </a:bgFillStyleLst>
+    </a:fmtScheme>
+  </a:themeElements>
+  <a:objectDefaults/>
+  <a:extraClrSchemeLst/>
+  <a:extLst>
+    <a:ext uri="{05A4C25C-085E-4340-85A3-A5531E510DB2}">
+      <thm15:themeFamily xmlns:thm15="http://schemas.microsoft.com/office/thememl/2012/main" name="Office Theme" id="{62F939B6-93AF-4DB8-9C6B-D6C7DFDC589F}" vid="{4A3C46E8-61CC-4603-A589-7422A47A8E4A}"/>
+    </a:ext>
+  </a:extLst>
+</a:theme>
 </file>
</xml_diff>

<commit_message>
Prospect brief: all tracked changes accepted
GEX-Why-Twelve-Gates-Prospect-Brief.docx at rules 4.1.0 with every tracked
change accepted (JML, 2026-10-22): proven technology basis in the coverage
table, the independent-verification benefit, the two waivable gates named,
and the closing line at version 4.1.0. No tracked markup left; passes the
Word validator.

Co-Authored-By: Claude Opus 5.5 <noreply@anthropic.com>
</commit_message>
<xml_diff>
--- a/gex-platform-enhanced/docs/GEX-Why-Twelve-Gates-Prospect-Brief.docx
+++ b/gex-platform-enhanced/docs/GEX-Why-Twelve-Gates-Prospect-Brief.docx
@@ -310,16 +310,9 @@
             <w:r>
               <w:t xml:space="preserve">Power, </w:t>
             </w:r>
-            <w:del w:id="9001" w:author="Claude" w:date="2026-10-21T19:30:00Z">
-              <w:r>
-                <w:delText>water and grid access</w:delText>
-              </w:r>
-            </w:del>
-            <w:ins w:id="9002" w:author="Claude" w:date="2026-10-21T19:30:00Z">
-              <w:r>
-                <w:t>utilities and a proven technology basis</w:t>
-              </w:r>
-            </w:ins>
+            <w:r>
+              <w:t>utilities and a proven technology basis</w:t>
+            </w:r>
           </w:p>
           <w:p>
             <w:pPr>
@@ -661,19 +654,15 @@
           <w:numId w:val="1"/>
         </w:numPr>
         <w:spacing w:after="60"/>
-        <w:rPr>
-          <w:ins w:id="9003" w:author="Claude" w:date="2026-10-21T19:30:00Z"/>
-        </w:rPr>
-      </w:pPr>
-      <w:ins w:id="9004" w:author="Claude" w:date="2026-10-21T19:30:00Z">
-        <w:r>
-          <w:rPr>
-            <w:b/>
-            <w:bCs/>
-          </w:rPr>
-          <w:t>Independent verification. Evidence counts only when an independent reviewer appointed to your project verifies it: never you, and never GEX. What financiers see has been checked by a party independent of you.</w:t>
-        </w:r>
-      </w:ins>
+        <w:rPr/>
+      </w:pPr>
+      <w:r>
+        <w:rPr>
+          <w:b/>
+          <w:bCs/>
+        </w:rPr>
+        <w:t>Independent verification. Evidence counts only when an independent reviewer appointed to your project verifies it: never you, and never GEX. What financiers see has been checked by a party independent of you.</w:t>
+      </w:r>
     </w:p>
     <w:p>
       <w:pPr>
@@ -694,37 +683,21 @@
       <w:r>
         <w:t xml:space="preserve">Each stage shows which capital decision becomes possible, from grants to </w:t>
       </w:r>
-      <w:del w:id="9008" w:author="Claude" w:date="2026-10-21T19:30:00Z">
-        <w:r>
-          <w:delText xml:space="preserve">senior debt</w:delText>
-        </w:r>
-      </w:del>
-      <w:ins w:id="9009" w:author="Claude" w:date="2026-10-21T19:30:00Z">
-        <w:r>
-          <w:t>a senior debt credit approval</w:t>
-        </w:r>
-      </w:ins>
+      <w:r>
+        <w:t>a senior debt credit approval</w:t>
+      </w:r>
       <w:r>
         <w:t xml:space="preserve">. </w:t>
       </w:r>
-      <w:del w:id="9006" w:author="Claude" w:date="2026-10-21T19:30:00Z">
-        <w:r>
-          <w:delText>Balance-sheet projects can skip the</w:delText>
-        </w:r>
-      </w:del>
-      <w:ins w:id="9007" w:author="Claude" w:date="2026-10-21T19:30:00Z">
-        <w:r>
-          <w:t>On a balance sheet, the two</w:t>
-        </w:r>
-      </w:ins>
+      <w:r>
+        <w:t>On a balance sheet, the two</w:t>
+      </w:r>
       <w:r>
         <w:t xml:space="preserve"> lender-only gates</w:t>
       </w:r>
-      <w:ins w:id="9005" w:author="Claude" w:date="2026-10-21T19:30:00Z">
-        <w:r>
-          <w:t>, independent engineer sign-off and the audited financial model, are waived</w:t>
-        </w:r>
-      </w:ins>
+      <w:r>
+        <w:t>, independent engineer sign-off and the audited financial model, are waived</w:t>
+      </w:r>
       <w:r>
         <w:t>.</w:t>
       </w:r>
@@ -758,82 +731,46 @@
         </w:rPr>
         <w:t xml:space="preserve">GreenEarthX · Based on the platform’s bankability rules, version </w:t>
       </w:r>
-      <w:del w:id="9014" w:author="Claude" w:date="2026-10-21T19:30:00Z">
-        <w:r>
-          <w:rPr>
-            <w:color w:val="6A7A76"/>
-            <w:sz w:val="18"/>
-            <w:szCs w:val="18"/>
-          </w:rPr>
-          <w:delText>3</w:delText>
-        </w:r>
-      </w:del>
-      <w:ins w:id="9015" w:author="Claude" w:date="2026-10-21T19:30:00Z">
-        <w:r>
-          <w:rPr>
-            <w:color w:val="6A7A76"/>
-            <w:sz w:val="18"/>
-            <w:szCs w:val="18"/>
-          </w:rPr>
-          <w:t>4</w:t>
-        </w:r>
-      </w:ins>
       <w:r>
         <w:rPr>
           <w:color w:val="6A7A76"/>
           <w:sz w:val="18"/>
           <w:szCs w:val="18"/>
         </w:rPr>
-        <w:t>.</w:t>
-      </w:r>
-      <w:del w:id="9012" w:author="Claude" w:date="2026-10-21T19:30:00Z">
-        <w:r>
-          <w:rPr>
-            <w:color w:val="6A7A76"/>
-            <w:sz w:val="18"/>
-            <w:szCs w:val="18"/>
-          </w:rPr>
-          <w:delText>0</w:delText>
-        </w:r>
-      </w:del>
-      <w:ins w:id="9013" w:author="Claude" w:date="2026-10-21T19:30:00Z">
-        <w:r>
-          <w:rPr>
-            <w:color w:val="6A7A76"/>
-            <w:sz w:val="18"/>
-            <w:szCs w:val="18"/>
-          </w:rPr>
-          <w:t>1</w:t>
-        </w:r>
-      </w:ins>
+        <w:t>4</w:t>
+      </w:r>
       <w:r>
         <w:rPr>
           <w:color w:val="6A7A76"/>
           <w:sz w:val="18"/>
           <w:szCs w:val="18"/>
         </w:rPr>
+        <w:t>.</w:t>
+      </w:r>
+      <w:r>
+        <w:rPr>
+          <w:color w:val="6A7A76"/>
+          <w:sz w:val="18"/>
+          <w:szCs w:val="18"/>
+        </w:rPr>
+        <w:t>1</w:t>
+      </w:r>
+      <w:r>
+        <w:rPr>
+          <w:color w:val="6A7A76"/>
+          <w:sz w:val="18"/>
+          <w:szCs w:val="18"/>
+        </w:rPr>
         <w:t>.0 (</w:t>
       </w:r>
-      <w:del w:id="9010" w:author="Claude" w:date="2026-10-21T19:30:00Z">
-        <w:r>
-          <w:rPr>
-            <w:color w:val="6A7A76"/>
-            <w:sz w:val="18"/>
-            <w:szCs w:val="18"/>
-          </w:rPr>
-          <w:delText>September</w:delText>
-        </w:r>
-      </w:del>
-      <w:ins w:id="9011" w:author="Claude" w:date="2026-10-21T19:30:00Z">
-        <w:r>
-          <w:rPr>
-            <w:color w:val="6A7A76"/>
-            <w:sz w:val="18"/>
-            <w:szCs w:val="18"/>
-          </w:rPr>
-          <w:t>October</w:t>
-        </w:r>
-      </w:ins>
+      <w:r>
+        <w:rPr>
+          <w:color w:val="6A7A76"/>
+          <w:sz w:val="18"/>
+          <w:szCs w:val="18"/>
+        </w:rPr>
+        <w:t>October</w:t>
+      </w:r>
       <w:r>
         <w:rPr>
           <w:color w:val="6A7A76"/>

</xml_diff>